<commit_message>
Update documentation with real-world installation experience
README rewritten with:
- Correct install command (/bin/bash -c "$(curl ...)" pattern)
- pipx instead of pip (PEP 668 compatibility)
- Vocabulary hints section
- Focus tracking explanation
- Real troubleshooting from live testing on stock MacBook Pro
- Default model changed to "small" throughout
- GitHub URL fixes (sevsorensen not severinsorensen)
- v0.1.1 in roadmap

User manual (DOCX) updated with:
- New Chapter 9: Teaching Claudia Your Words (Vocabulary Hints)
- Updated Chapter 3: Correct install commands and pipx
- Updated Chapter 6: Focus tracking explanation
- Updated Chapter 8: Default model is now "small"
- Updated Chapter 13: Real troubleshooting (PEP 668, config.json, focus)
- Glossary additions: pipx, PEP 668, Vocabulary Hints
- 16 chapters (was 15)

Co-Authored-By: Claude Opus 4.6 <noreply@anthropic.com>
</commit_message>
<xml_diff>
--- a/docs/Claudia-Chatterley-User-Manual.docx
+++ b/docs/Claudia-Chatterley-User-Manual.docx
@@ -93,7 +93,7 @@
           <w:sz w:val="22"/>
           <w:szCs w:val="22"/>
         </w:rPr>
-        <w:t xml:space="preserve">Version 0.1.0</w:t>
+        <w:t xml:space="preserve">Version 0.1.1</w:t>
       </w:r>
     </w:p>
     <w:p>
@@ -310,7 +310,7 @@
           <w:sz w:val="22"/>
           <w:szCs w:val="22"/>
         </w:rPr>
-        <w:t xml:space="preserve">9.   Using Cloud Transcription (Optional)</w:t>
+        <w:t xml:space="preserve">9.   Teaching Claudia Your Words (Vocabulary Hints)</w:t>
       </w:r>
     </w:p>
     <w:p>
@@ -323,7 +323,7 @@
           <w:sz w:val="22"/>
           <w:szCs w:val="22"/>
         </w:rPr>
-        <w:t xml:space="preserve">10.  Changing Your Settings</w:t>
+        <w:t xml:space="preserve">10.  Using Cloud Transcription (Optional)</w:t>
       </w:r>
     </w:p>
     <w:p>
@@ -336,7 +336,7 @@
           <w:sz w:val="22"/>
           <w:szCs w:val="22"/>
         </w:rPr>
-        <w:t xml:space="preserve">11.  All the Commands You Can Type</w:t>
+        <w:t xml:space="preserve">11.  Changing Your Settings</w:t>
       </w:r>
     </w:p>
     <w:p>
@@ -349,7 +349,7 @@
           <w:sz w:val="22"/>
           <w:szCs w:val="22"/>
         </w:rPr>
-        <w:t xml:space="preserve">12.  Troubleshooting — When Things Go Wrong</w:t>
+        <w:t xml:space="preserve">12.  All the Commands You Can Type</w:t>
       </w:r>
     </w:p>
     <w:p>
@@ -362,7 +362,7 @@
           <w:sz w:val="22"/>
           <w:szCs w:val="22"/>
         </w:rPr>
-        <w:t xml:space="preserve">13.  Frequently Asked Questions</w:t>
+        <w:t xml:space="preserve">13.  Troubleshooting — When Things Go Wrong</w:t>
       </w:r>
     </w:p>
     <w:p>
@@ -375,7 +375,7 @@
           <w:sz w:val="22"/>
           <w:szCs w:val="22"/>
         </w:rPr>
-        <w:t xml:space="preserve">14.  What’s Coming Next (Roadmap)</w:t>
+        <w:t xml:space="preserve">14.  Frequently Asked Questions</w:t>
       </w:r>
     </w:p>
     <w:p>
@@ -388,7 +388,20 @@
           <w:sz w:val="22"/>
           <w:szCs w:val="22"/>
         </w:rPr>
-        <w:t xml:space="preserve">15.  Glossary — Words You Might Not Know</w:t>
+        <w:t xml:space="preserve">15.  What’s Coming Next (Roadmap)</w:t>
+      </w:r>
+    </w:p>
+    <w:p>
+      <w:pPr>
+        <w:spacing w:after="200" w:line="276"/>
+      </w:pPr>
+      <w:r>
+        <w:rPr>
+          <w:rFonts w:ascii="Arial" w:cs="Arial" w:eastAsia="Arial" w:hAnsi="Arial"/>
+          <w:sz w:val="22"/>
+          <w:szCs w:val="22"/>
+        </w:rPr>
+        <w:t xml:space="preserve">16.  Glossary — Words You Might Not Know</w:t>
       </w:r>
     </w:p>
     <w:p>
@@ -1384,7 +1397,78 @@
                 <w:sz w:val="20"/>
                 <w:szCs w:val="20"/>
               </w:rPr>
-              <w:t xml:space="preserve">curl -sSL https://raw.githubusercontent.com/severinsorensen/claudia-chatterley/main/setup.sh | bash</w:t>
+              <w:t xml:space="preserve">/bin/bash -c "$(curl -fsSL https://raw.githubusercontent.com/sevsorensen/claudia-chatterley/main/setup.sh)"</w:t>
+            </w:r>
+          </w:p>
+        </w:tc>
+      </w:tr>
+    </w:tbl>
+    <w:p>
+      <w:pPr>
+        <w:spacing w:after="120"/>
+      </w:pPr>
+    </w:p>
+    <w:tbl>
+      <w:tblPr>
+        <w:tblW w:type="dxa" w:w="9360"/>
+        <w:tblBorders>
+          <w:top w:val="single" w:color="auto" w:sz="4"/>
+          <w:left w:val="single" w:color="auto" w:sz="4"/>
+          <w:bottom w:val="single" w:color="auto" w:sz="4"/>
+          <w:right w:val="single" w:color="auto" w:sz="4"/>
+          <w:insideH w:val="single" w:color="auto" w:sz="4"/>
+          <w:insideV w:val="single" w:color="auto" w:sz="4"/>
+        </w:tblBorders>
+      </w:tblPr>
+      <w:tblGrid>
+        <w:gridCol w:w="9360"/>
+      </w:tblGrid>
+      <w:tr>
+        <w:tc>
+          <w:tcPr>
+            <w:tcW w:type="dxa" w:w="9360"/>
+            <w:tcBorders>
+              <w:top w:val="none" w:color="FFFFFF" w:sz="0"/>
+              <w:left w:val="single" w:color="2E86C1" w:sz="12"/>
+              <w:bottom w:val="none" w:color="FFFFFF" w:sz="0"/>
+              <w:right w:val="none" w:color="FFFFFF" w:sz="0"/>
+            </w:tcBorders>
+            <w:shd w:fill="D6EAF8" w:val="clear"/>
+            <w:tcMar>
+              <w:top w:type="dxa" w:w="120"/>
+              <w:left w:type="dxa" w:w="200"/>
+              <w:bottom w:type="dxa" w:w="120"/>
+              <w:right w:type="dxa" w:w="200"/>
+            </w:tcMar>
+          </w:tcPr>
+          <w:p>
+            <w:pPr>
+              <w:spacing w:after="80"/>
+            </w:pPr>
+            <w:r>
+              <w:rPr>
+                <w:rFonts w:ascii="Arial" w:cs="Arial" w:eastAsia="Arial" w:hAnsi="Arial"/>
+                <w:b/>
+                <w:bCs/>
+                <w:color w:val="1B4F72"/>
+                <w:sz w:val="22"/>
+                <w:szCs w:val="22"/>
+              </w:rPr>
+              <w:t xml:space="preserve">Why this format?</w:t>
+            </w:r>
+          </w:p>
+          <w:p>
+            <w:pPr>
+              <w:spacing w:after="0"/>
+            </w:pPr>
+            <w:r>
+              <w:rPr>
+                <w:rFonts w:ascii="Arial" w:cs="Arial" w:eastAsia="Arial" w:hAnsi="Arial"/>
+                <w:color w:val="2C3E50"/>
+                <w:sz w:val="21"/>
+                <w:szCs w:val="21"/>
+              </w:rPr>
+              <w:t xml:space="preserve">This downloads the script as a string first, then runs it. That keeps your keyboard working so the installer can ask you yes/no questions. (This is the same pattern Homebrew’s own installer uses.)</w:t>
             </w:r>
           </w:p>
         </w:tc>
@@ -1737,6 +1821,72 @@
                 <w:sz w:val="20"/>
                 <w:szCs w:val="20"/>
               </w:rPr>
+              <w:t xml:space="preserve">pipx</w:t>
+            </w:r>
+          </w:p>
+        </w:tc>
+        <w:tc>
+          <w:tcPr>
+            <w:tcW w:type="dxa" w:w="6360"/>
+            <w:tcBorders>
+              <w:top w:val="single" w:color="BDC3C7" w:sz="1"/>
+              <w:left w:val="single" w:color="BDC3C7" w:sz="1"/>
+              <w:bottom w:val="single" w:color="BDC3C7" w:sz="1"/>
+              <w:right w:val="single" w:color="BDC3C7" w:sz="1"/>
+            </w:tcBorders>
+            <w:shd w:fill="F2F3F4" w:val="clear"/>
+            <w:tcMar>
+              <w:top w:type="dxa" w:w="60"/>
+              <w:left w:type="dxa" w:w="100"/>
+              <w:bottom w:type="dxa" w:w="60"/>
+              <w:right w:type="dxa" w:w="100"/>
+            </w:tcMar>
+          </w:tcPr>
+          <w:p>
+            <w:pPr>
+              <w:spacing w:after="0"/>
+            </w:pPr>
+            <w:r>
+              <w:rPr>
+                <w:rFonts w:ascii="Arial" w:cs="Arial" w:eastAsia="Arial" w:hAnsi="Arial"/>
+                <w:color w:val="2C3E50"/>
+                <w:sz w:val="20"/>
+                <w:szCs w:val="20"/>
+              </w:rPr>
+              <w:t xml:space="preserve">Install via Homebrew. pipx is the safe way to install Python apps — it creates an isolated environment so nothing conflicts.</w:t>
+            </w:r>
+          </w:p>
+        </w:tc>
+      </w:tr>
+      <w:tr>
+        <w:tc>
+          <w:tcPr>
+            <w:tcW w:type="dxa" w:w="3000"/>
+            <w:tcBorders>
+              <w:top w:val="single" w:color="BDC3C7" w:sz="1"/>
+              <w:left w:val="single" w:color="BDC3C7" w:sz="1"/>
+              <w:bottom w:val="single" w:color="BDC3C7" w:sz="1"/>
+              <w:right w:val="single" w:color="BDC3C7" w:sz="1"/>
+            </w:tcBorders>
+            <w:shd w:fill="FFFFFF" w:val="clear"/>
+            <w:tcMar>
+              <w:top w:type="dxa" w:w="60"/>
+              <w:left w:type="dxa" w:w="100"/>
+              <w:bottom w:type="dxa" w:w="60"/>
+              <w:right w:type="dxa" w:w="100"/>
+            </w:tcMar>
+          </w:tcPr>
+          <w:p>
+            <w:pPr>
+              <w:spacing w:after="0"/>
+            </w:pPr>
+            <w:r>
+              <w:rPr>
+                <w:rFonts w:ascii="Arial" w:cs="Arial" w:eastAsia="Arial" w:hAnsi="Arial"/>
+                <w:color w:val="2C3E50"/>
+                <w:sz w:val="20"/>
+                <w:szCs w:val="20"/>
+              </w:rPr>
               <w:t xml:space="preserve">Claudia itself</w:t>
             </w:r>
           </w:p>
@@ -1750,26 +1900,26 @@
               <w:bottom w:val="single" w:color="BDC3C7" w:sz="1"/>
               <w:right w:val="single" w:color="BDC3C7" w:sz="1"/>
             </w:tcBorders>
-            <w:shd w:fill="F2F3F4" w:val="clear"/>
-            <w:tcMar>
-              <w:top w:type="dxa" w:w="60"/>
-              <w:left w:type="dxa" w:w="100"/>
-              <w:bottom w:type="dxa" w:w="60"/>
-              <w:right w:type="dxa" w:w="100"/>
-            </w:tcMar>
-          </w:tcPr>
-          <w:p>
-            <w:pPr>
-              <w:spacing w:after="0"/>
-            </w:pPr>
-            <w:r>
-              <w:rPr>
-                <w:rFonts w:ascii="Arial" w:cs="Arial" w:eastAsia="Arial" w:hAnsi="Arial"/>
-                <w:color w:val="2C3E50"/>
-                <w:sz w:val="20"/>
-                <w:szCs w:val="20"/>
-              </w:rPr>
-              <w:t xml:space="preserve">Download and install the Claudia Chatterley program. Takes about 1 minute.</w:t>
+            <w:shd w:fill="FFFFFF" w:val="clear"/>
+            <w:tcMar>
+              <w:top w:type="dxa" w:w="60"/>
+              <w:left w:type="dxa" w:w="100"/>
+              <w:bottom w:type="dxa" w:w="60"/>
+              <w:right w:type="dxa" w:w="100"/>
+            </w:tcMar>
+          </w:tcPr>
+          <w:p>
+            <w:pPr>
+              <w:spacing w:after="0"/>
+            </w:pPr>
+            <w:r>
+              <w:rPr>
+                <w:rFonts w:ascii="Arial" w:cs="Arial" w:eastAsia="Arial" w:hAnsi="Arial"/>
+                <w:color w:val="2C3E50"/>
+                <w:sz w:val="20"/>
+                <w:szCs w:val="20"/>
+              </w:rPr>
+              <w:t xml:space="preserve">Download and install Claudia from GitHub via pipx. Takes about 1 minute.</w:t>
             </w:r>
           </w:p>
         </w:tc>
@@ -1967,7 +2117,7 @@
                 <w:sz w:val="20"/>
                 <w:szCs w:val="20"/>
               </w:rPr>
-              <w:t xml:space="preserve">git clone https://github.com/severinsorensen/claudia-chatterley.git</w:t>
+              <w:t xml:space="preserve">git clone https://github.com/sevsorensen/claudia-chatterley.git</w:t>
             </w:r>
           </w:p>
         </w:tc>
@@ -2218,7 +2368,8 @@
                 <w:sz w:val="20"/>
                 <w:szCs w:val="20"/>
               </w:rPr>
-              <w:t xml:space="preserve">brew install portaudio &amp;&amp; pip3 install claudia-chatterley</w:t>
+              <w:t xml:space="preserve">brew install portaudio pipx
+pipx install git+https://github.com/sevsorensen/claudia-chatterley.git</w:t>
             </w:r>
           </w:p>
         </w:tc>
@@ -2250,11 +2401,11 @@
             <w:tcW w:type="dxa" w:w="9360"/>
             <w:tcBorders>
               <w:top w:val="none" w:color="FFFFFF" w:sz="0"/>
-              <w:left w:val="single" w:color="D4740B" w:sz="12"/>
+              <w:left w:val="single" w:color="2E86C1" w:sz="12"/>
               <w:bottom w:val="none" w:color="FFFFFF" w:sz="0"/>
               <w:right w:val="none" w:color="FFFFFF" w:sz="0"/>
             </w:tcBorders>
-            <w:shd w:fill="FEF5E7" w:val="clear"/>
+            <w:shd w:fill="D6EAF8" w:val="clear"/>
             <w:tcMar>
               <w:top w:type="dxa" w:w="120"/>
               <w:left w:type="dxa" w:w="200"/>
@@ -2271,11 +2422,11 @@
                 <w:rFonts w:ascii="Arial" w:cs="Arial" w:eastAsia="Arial" w:hAnsi="Arial"/>
                 <w:b/>
                 <w:bCs/>
-                <w:color w:val="D4740B"/>
+                <w:color w:val="1B4F72"/>
                 <w:sz w:val="22"/>
                 <w:szCs w:val="22"/>
               </w:rPr>
-              <w:t xml:space="preserve">First-Time Download</w:t>
+              <w:t xml:space="preserve">Why pipx instead of pip?</w:t>
             </w:r>
           </w:p>
           <w:p>
@@ -2289,217 +2440,12 @@
                 <w:sz w:val="21"/>
                 <w:szCs w:val="21"/>
               </w:rPr>
-              <w:t xml:space="preserve">The first time you run Claudia, it will download a “Whisper” speech model (about 140 MB). This only happens once. After that, everything runs instantly from your computer.</w:t>
+              <w:t xml:space="preserve">Homebrew’s Python 3.12 blocks system-wide pip installs (a policy called PEP 668). pipx works around this by creating an isolated environment for each app. It’s Homebrew’s recommended approach.</w:t>
             </w:r>
           </w:p>
         </w:tc>
       </w:tr>
     </w:tbl>
-    <w:p>
-      <w:pPr>
-        <w:pStyle w:val="Heading1"/>
-        <w:pageBreakBefore/>
-      </w:pPr>
-      <w:r>
-        <w:rPr>
-          <w:b/>
-          <w:bCs/>
-        </w:rPr>
-        <w:t xml:space="preserve">4. Giving Claudia Permission</w:t>
-      </w:r>
-    </w:p>
-    <w:p>
-      <w:pPr>
-        <w:spacing w:after="200" w:line="276"/>
-      </w:pPr>
-      <w:r>
-        <w:rPr>
-          <w:rFonts w:ascii="Arial" w:cs="Arial" w:eastAsia="Arial" w:hAnsi="Arial"/>
-          <w:sz w:val="22"/>
-          <w:szCs w:val="22"/>
-        </w:rPr>
-        <w:t xml:space="preserve">Your Mac protects you by asking permission before any program can control the keyboard or use the microphone. Claudia needs two permissions:</w:t>
-      </w:r>
-    </w:p>
-    <w:p>
-      <w:pPr>
-        <w:spacing w:after="120"/>
-      </w:pPr>
-    </w:p>
-    <w:p>
-      <w:pPr>
-        <w:pStyle w:val="Heading2"/>
-      </w:pPr>
-      <w:r>
-        <w:rPr>
-          <w:b/>
-          <w:bCs/>
-        </w:rPr>
-        <w:t xml:space="preserve">Permission 1: Accessibility (Required)</w:t>
-      </w:r>
-    </w:p>
-    <w:p>
-      <w:pPr>
-        <w:spacing w:after="200" w:line="276"/>
-      </w:pPr>
-      <w:r>
-        <w:rPr>
-          <w:rFonts w:ascii="Arial" w:cs="Arial" w:eastAsia="Arial" w:hAnsi="Arial"/>
-          <w:sz w:val="22"/>
-          <w:szCs w:val="22"/>
-        </w:rPr>
-        <w:t xml:space="preserve">This lets Claudia paste text into other apps by simulating a Cmd+V keystroke.</w:t>
-      </w:r>
-    </w:p>
-    <w:p>
-      <w:pPr>
-        <w:spacing w:after="120"/>
-      </w:pPr>
-    </w:p>
-    <w:p>
-      <w:pPr>
-        <w:spacing w:after="200" w:line="276"/>
-      </w:pPr>
-      <w:r>
-        <w:rPr>
-          <w:rFonts w:ascii="Arial" w:cs="Arial" w:eastAsia="Arial" w:hAnsi="Arial"/>
-          <w:b/>
-          <w:bCs/>
-          <w:color w:val="2E86C1"/>
-          <w:sz w:val="24"/>
-          <w:szCs w:val="24"/>
-        </w:rPr>
-        <w:t xml:space="preserve">Step 1: </w:t>
-      </w:r>
-      <w:r>
-        <w:rPr>
-          <w:rFonts w:ascii="Arial" w:cs="Arial" w:eastAsia="Arial" w:hAnsi="Arial"/>
-          <w:sz w:val="22"/>
-          <w:szCs w:val="22"/>
-        </w:rPr>
-        <w:t xml:space="preserve">Open System Settings (click the Apple menu at the top-left of your screen).</w:t>
-      </w:r>
-    </w:p>
-    <w:p>
-      <w:pPr>
-        <w:spacing w:after="200" w:line="276"/>
-      </w:pPr>
-      <w:r>
-        <w:rPr>
-          <w:rFonts w:ascii="Arial" w:cs="Arial" w:eastAsia="Arial" w:hAnsi="Arial"/>
-          <w:b/>
-          <w:bCs/>
-          <w:color w:val="2E86C1"/>
-          <w:sz w:val="24"/>
-          <w:szCs w:val="24"/>
-        </w:rPr>
-        <w:t xml:space="preserve">Step 2: </w:t>
-      </w:r>
-      <w:r>
-        <w:rPr>
-          <w:rFonts w:ascii="Arial" w:cs="Arial" w:eastAsia="Arial" w:hAnsi="Arial"/>
-          <w:sz w:val="22"/>
-          <w:szCs w:val="22"/>
-        </w:rPr>
-        <w:t xml:space="preserve">Click Privacy &amp; Security in the sidebar.</w:t>
-      </w:r>
-    </w:p>
-    <w:p>
-      <w:pPr>
-        <w:spacing w:after="200" w:line="276"/>
-      </w:pPr>
-      <w:r>
-        <w:rPr>
-          <w:rFonts w:ascii="Arial" w:cs="Arial" w:eastAsia="Arial" w:hAnsi="Arial"/>
-          <w:b/>
-          <w:bCs/>
-          <w:color w:val="2E86C1"/>
-          <w:sz w:val="24"/>
-          <w:szCs w:val="24"/>
-        </w:rPr>
-        <w:t xml:space="preserve">Step 3: </w:t>
-      </w:r>
-      <w:r>
-        <w:rPr>
-          <w:rFonts w:ascii="Arial" w:cs="Arial" w:eastAsia="Arial" w:hAnsi="Arial"/>
-          <w:sz w:val="22"/>
-          <w:szCs w:val="22"/>
-        </w:rPr>
-        <w:t xml:space="preserve">Click Accessibility.</w:t>
-      </w:r>
-    </w:p>
-    <w:p>
-      <w:pPr>
-        <w:spacing w:after="200" w:line="276"/>
-      </w:pPr>
-      <w:r>
-        <w:rPr>
-          <w:rFonts w:ascii="Arial" w:cs="Arial" w:eastAsia="Arial" w:hAnsi="Arial"/>
-          <w:b/>
-          <w:bCs/>
-          <w:color w:val="2E86C1"/>
-          <w:sz w:val="24"/>
-          <w:szCs w:val="24"/>
-        </w:rPr>
-        <w:t xml:space="preserve">Step 4: </w:t>
-      </w:r>
-      <w:r>
-        <w:rPr>
-          <w:rFonts w:ascii="Arial" w:cs="Arial" w:eastAsia="Arial" w:hAnsi="Arial"/>
-          <w:sz w:val="22"/>
-          <w:szCs w:val="22"/>
-        </w:rPr>
-        <w:t xml:space="preserve">Click the + button.</w:t>
-      </w:r>
-    </w:p>
-    <w:p>
-      <w:pPr>
-        <w:spacing w:after="200" w:line="276"/>
-      </w:pPr>
-      <w:r>
-        <w:rPr>
-          <w:rFonts w:ascii="Arial" w:cs="Arial" w:eastAsia="Arial" w:hAnsi="Arial"/>
-          <w:b/>
-          <w:bCs/>
-          <w:color w:val="2E86C1"/>
-          <w:sz w:val="24"/>
-          <w:szCs w:val="24"/>
-        </w:rPr>
-        <w:t xml:space="preserve">Step 5: </w:t>
-      </w:r>
-      <w:r>
-        <w:rPr>
-          <w:rFonts w:ascii="Arial" w:cs="Arial" w:eastAsia="Arial" w:hAnsi="Arial"/>
-          <w:sz w:val="22"/>
-          <w:szCs w:val="22"/>
-        </w:rPr>
-        <w:t xml:space="preserve">Find and add Terminal (in Applications &gt; Utilities &gt; Terminal).</w:t>
-      </w:r>
-    </w:p>
-    <w:p>
-      <w:pPr>
-        <w:spacing w:after="200" w:line="276"/>
-      </w:pPr>
-      <w:r>
-        <w:rPr>
-          <w:rFonts w:ascii="Arial" w:cs="Arial" w:eastAsia="Arial" w:hAnsi="Arial"/>
-          <w:b/>
-          <w:bCs/>
-          <w:color w:val="2E86C1"/>
-          <w:sz w:val="24"/>
-          <w:szCs w:val="24"/>
-        </w:rPr>
-        <w:t xml:space="preserve">Step 6: </w:t>
-      </w:r>
-      <w:r>
-        <w:rPr>
-          <w:rFonts w:ascii="Arial" w:cs="Arial" w:eastAsia="Arial" w:hAnsi="Arial"/>
-          <w:sz w:val="22"/>
-          <w:szCs w:val="22"/>
-        </w:rPr>
-        <w:t xml:space="preserve">Make sure the toggle next to Terminal is turned ON (blue).</w:t>
-      </w:r>
-    </w:p>
     <w:p>
       <w:pPr>
         <w:spacing w:after="120"/>
@@ -2526,11 +2472,11 @@
             <w:tcW w:type="dxa" w:w="9360"/>
             <w:tcBorders>
               <w:top w:val="none" w:color="FFFFFF" w:sz="0"/>
-              <w:left w:val="single" w:color="2E86C1" w:sz="12"/>
+              <w:left w:val="single" w:color="D4740B" w:sz="12"/>
               <w:bottom w:val="none" w:color="FFFFFF" w:sz="0"/>
               <w:right w:val="none" w:color="FFFFFF" w:sz="0"/>
             </w:tcBorders>
-            <w:shd w:fill="D6EAF8" w:val="clear"/>
+            <w:shd w:fill="FEF5E7" w:val="clear"/>
             <w:tcMar>
               <w:top w:type="dxa" w:w="120"/>
               <w:left w:type="dxa" w:w="200"/>
@@ -2547,11 +2493,11 @@
                 <w:rFonts w:ascii="Arial" w:cs="Arial" w:eastAsia="Arial" w:hAnsi="Arial"/>
                 <w:b/>
                 <w:bCs/>
-                <w:color w:val="1B4F72"/>
+                <w:color w:val="D4740B"/>
                 <w:sz w:val="22"/>
                 <w:szCs w:val="22"/>
               </w:rPr>
-              <w:t xml:space="preserve">Using a different terminal?</w:t>
+              <w:t xml:space="preserve">First-Time Download</w:t>
             </w:r>
           </w:p>
           <w:p>
@@ -2565,7 +2511,7 @@
                 <w:sz w:val="21"/>
                 <w:szCs w:val="21"/>
               </w:rPr>
-              <w:t xml:space="preserve">If you use iTerm, Warp, or another terminal app, add that app instead of Terminal. The key is to add whatever app you use to run the claudia command.</w:t>
+              <w:t xml:space="preserve">The first time you run Claudia, it will download a “Whisper” speech model (about 460 MB for the “small” model). This only happens once. After that, everything runs instantly from your computer.</w:t>
             </w:r>
           </w:p>
         </w:tc>
@@ -2573,19 +2519,15 @@
     </w:tbl>
     <w:p>
       <w:pPr>
-        <w:spacing w:after="120"/>
-      </w:pPr>
-    </w:p>
-    <w:p>
-      <w:pPr>
-        <w:pStyle w:val="Heading2"/>
+        <w:pStyle w:val="Heading1"/>
+        <w:pageBreakBefore/>
       </w:pPr>
       <w:r>
         <w:rPr>
           <w:b/>
           <w:bCs/>
         </w:rPr>
-        <w:t xml:space="preserve">Permission 2: Microphone (Automatic)</w:t>
+        <w:t xml:space="preserve">4. Giving Claudia Permission</w:t>
       </w:r>
     </w:p>
     <w:p>
@@ -2598,7 +2540,7 @@
           <w:sz w:val="22"/>
           <w:szCs w:val="22"/>
         </w:rPr>
-        <w:t xml:space="preserve">The first time Claudia tries to listen to your microphone, macOS will show a pop-up asking for permission. Just click Allow. You only have to do this once.</w:t>
+        <w:t xml:space="preserve">Your Mac protects you by asking permission before any program can control the keyboard or use the microphone. Claudia needs two permissions:</w:t>
       </w:r>
     </w:p>
     <w:p>
@@ -2608,14 +2550,14 @@
     </w:p>
     <w:p>
       <w:pPr>
-        <w:pStyle w:val="Heading1"/>
+        <w:pStyle w:val="Heading2"/>
       </w:pPr>
       <w:r>
         <w:rPr>
           <w:b/>
           <w:bCs/>
         </w:rPr>
-        <w:t xml:space="preserve">5. Starting Claudia</w:t>
+        <w:t xml:space="preserve">Permission 1: Accessibility (Required)</w:t>
       </w:r>
     </w:p>
     <w:p>
@@ -2628,8 +2570,162 @@
           <w:sz w:val="22"/>
           <w:szCs w:val="22"/>
         </w:rPr>
-        <w:t xml:space="preserve">Open Terminal and type:</w:t>
-      </w:r>
+        <w:t xml:space="preserve">This lets Claudia paste text into other apps by simulating a Cmd+V keystroke.</w:t>
+      </w:r>
+    </w:p>
+    <w:p>
+      <w:pPr>
+        <w:spacing w:after="120"/>
+      </w:pPr>
+    </w:p>
+    <w:p>
+      <w:pPr>
+        <w:spacing w:after="200" w:line="276"/>
+      </w:pPr>
+      <w:r>
+        <w:rPr>
+          <w:rFonts w:ascii="Arial" w:cs="Arial" w:eastAsia="Arial" w:hAnsi="Arial"/>
+          <w:b/>
+          <w:bCs/>
+          <w:color w:val="2E86C1"/>
+          <w:sz w:val="24"/>
+          <w:szCs w:val="24"/>
+        </w:rPr>
+        <w:t xml:space="preserve">Step 1: </w:t>
+      </w:r>
+      <w:r>
+        <w:rPr>
+          <w:rFonts w:ascii="Arial" w:cs="Arial" w:eastAsia="Arial" w:hAnsi="Arial"/>
+          <w:sz w:val="22"/>
+          <w:szCs w:val="22"/>
+        </w:rPr>
+        <w:t xml:space="preserve">Open System Settings (click the Apple menu at the top-left of your screen).</w:t>
+      </w:r>
+    </w:p>
+    <w:p>
+      <w:pPr>
+        <w:spacing w:after="200" w:line="276"/>
+      </w:pPr>
+      <w:r>
+        <w:rPr>
+          <w:rFonts w:ascii="Arial" w:cs="Arial" w:eastAsia="Arial" w:hAnsi="Arial"/>
+          <w:b/>
+          <w:bCs/>
+          <w:color w:val="2E86C1"/>
+          <w:sz w:val="24"/>
+          <w:szCs w:val="24"/>
+        </w:rPr>
+        <w:t xml:space="preserve">Step 2: </w:t>
+      </w:r>
+      <w:r>
+        <w:rPr>
+          <w:rFonts w:ascii="Arial" w:cs="Arial" w:eastAsia="Arial" w:hAnsi="Arial"/>
+          <w:sz w:val="22"/>
+          <w:szCs w:val="22"/>
+        </w:rPr>
+        <w:t xml:space="preserve">Click Privacy &amp; Security in the sidebar.</w:t>
+      </w:r>
+    </w:p>
+    <w:p>
+      <w:pPr>
+        <w:spacing w:after="200" w:line="276"/>
+      </w:pPr>
+      <w:r>
+        <w:rPr>
+          <w:rFonts w:ascii="Arial" w:cs="Arial" w:eastAsia="Arial" w:hAnsi="Arial"/>
+          <w:b/>
+          <w:bCs/>
+          <w:color w:val="2E86C1"/>
+          <w:sz w:val="24"/>
+          <w:szCs w:val="24"/>
+        </w:rPr>
+        <w:t xml:space="preserve">Step 3: </w:t>
+      </w:r>
+      <w:r>
+        <w:rPr>
+          <w:rFonts w:ascii="Arial" w:cs="Arial" w:eastAsia="Arial" w:hAnsi="Arial"/>
+          <w:sz w:val="22"/>
+          <w:szCs w:val="22"/>
+        </w:rPr>
+        <w:t xml:space="preserve">Click Accessibility.</w:t>
+      </w:r>
+    </w:p>
+    <w:p>
+      <w:pPr>
+        <w:spacing w:after="200" w:line="276"/>
+      </w:pPr>
+      <w:r>
+        <w:rPr>
+          <w:rFonts w:ascii="Arial" w:cs="Arial" w:eastAsia="Arial" w:hAnsi="Arial"/>
+          <w:b/>
+          <w:bCs/>
+          <w:color w:val="2E86C1"/>
+          <w:sz w:val="24"/>
+          <w:szCs w:val="24"/>
+        </w:rPr>
+        <w:t xml:space="preserve">Step 4: </w:t>
+      </w:r>
+      <w:r>
+        <w:rPr>
+          <w:rFonts w:ascii="Arial" w:cs="Arial" w:eastAsia="Arial" w:hAnsi="Arial"/>
+          <w:sz w:val="22"/>
+          <w:szCs w:val="22"/>
+        </w:rPr>
+        <w:t xml:space="preserve">Click the + button.</w:t>
+      </w:r>
+    </w:p>
+    <w:p>
+      <w:pPr>
+        <w:spacing w:after="200" w:line="276"/>
+      </w:pPr>
+      <w:r>
+        <w:rPr>
+          <w:rFonts w:ascii="Arial" w:cs="Arial" w:eastAsia="Arial" w:hAnsi="Arial"/>
+          <w:b/>
+          <w:bCs/>
+          <w:color w:val="2E86C1"/>
+          <w:sz w:val="24"/>
+          <w:szCs w:val="24"/>
+        </w:rPr>
+        <w:t xml:space="preserve">Step 5: </w:t>
+      </w:r>
+      <w:r>
+        <w:rPr>
+          <w:rFonts w:ascii="Arial" w:cs="Arial" w:eastAsia="Arial" w:hAnsi="Arial"/>
+          <w:sz w:val="22"/>
+          <w:szCs w:val="22"/>
+        </w:rPr>
+        <w:t xml:space="preserve">Find and add Terminal (in Applications &gt; Utilities &gt; Terminal).</w:t>
+      </w:r>
+    </w:p>
+    <w:p>
+      <w:pPr>
+        <w:spacing w:after="200" w:line="276"/>
+      </w:pPr>
+      <w:r>
+        <w:rPr>
+          <w:rFonts w:ascii="Arial" w:cs="Arial" w:eastAsia="Arial" w:hAnsi="Arial"/>
+          <w:b/>
+          <w:bCs/>
+          <w:color w:val="2E86C1"/>
+          <w:sz w:val="24"/>
+          <w:szCs w:val="24"/>
+        </w:rPr>
+        <w:t xml:space="preserve">Step 6: </w:t>
+      </w:r>
+      <w:r>
+        <w:rPr>
+          <w:rFonts w:ascii="Arial" w:cs="Arial" w:eastAsia="Arial" w:hAnsi="Arial"/>
+          <w:sz w:val="22"/>
+          <w:szCs w:val="22"/>
+        </w:rPr>
+        <w:t xml:space="preserve">Make sure the toggle next to Terminal is turned ON (blue).</w:t>
+      </w:r>
+    </w:p>
+    <w:p>
+      <w:pPr>
+        <w:spacing w:after="120"/>
+      </w:pPr>
     </w:p>
     <w:tbl>
       <w:tblPr>
@@ -2652,30 +2748,46 @@
             <w:tcW w:type="dxa" w:w="9360"/>
             <w:tcBorders>
               <w:top w:val="none" w:color="FFFFFF" w:sz="0"/>
-              <w:left w:val="none" w:color="FFFFFF" w:sz="0"/>
+              <w:left w:val="single" w:color="2E86C1" w:sz="12"/>
               <w:bottom w:val="none" w:color="FFFFFF" w:sz="0"/>
               <w:right w:val="none" w:color="FFFFFF" w:sz="0"/>
             </w:tcBorders>
-            <w:shd w:fill="2C3E50" w:val="clear"/>
-            <w:tcMar>
-              <w:top w:type="dxa" w:w="100"/>
+            <w:shd w:fill="D6EAF8" w:val="clear"/>
+            <w:tcMar>
+              <w:top w:type="dxa" w:w="120"/>
               <w:left w:type="dxa" w:w="200"/>
-              <w:bottom w:type="dxa" w:w="100"/>
+              <w:bottom w:type="dxa" w:w="120"/>
               <w:right w:type="dxa" w:w="200"/>
             </w:tcMar>
           </w:tcPr>
           <w:p>
             <w:pPr>
-              <w:spacing w:after="0"/>
-            </w:pPr>
-            <w:r>
-              <w:rPr>
-                <w:rFonts w:ascii="Courier New" w:cs="Courier New" w:eastAsia="Courier New" w:hAnsi="Courier New"/>
-                <w:color w:val="F0F0F0"/>
-                <w:sz w:val="20"/>
-                <w:szCs w:val="20"/>
-              </w:rPr>
-              <w:t xml:space="preserve">claudia</w:t>
+              <w:spacing w:after="80"/>
+            </w:pPr>
+            <w:r>
+              <w:rPr>
+                <w:rFonts w:ascii="Arial" w:cs="Arial" w:eastAsia="Arial" w:hAnsi="Arial"/>
+                <w:b/>
+                <w:bCs/>
+                <w:color w:val="1B4F72"/>
+                <w:sz w:val="22"/>
+                <w:szCs w:val="22"/>
+              </w:rPr>
+              <w:t xml:space="preserve">Using a different terminal?</w:t>
+            </w:r>
+          </w:p>
+          <w:p>
+            <w:pPr>
+              <w:spacing w:after="0"/>
+            </w:pPr>
+            <w:r>
+              <w:rPr>
+                <w:rFonts w:ascii="Arial" w:cs="Arial" w:eastAsia="Arial" w:hAnsi="Arial"/>
+                <w:color w:val="2C3E50"/>
+                <w:sz w:val="21"/>
+                <w:szCs w:val="21"/>
+              </w:rPr>
+              <w:t xml:space="preserve">If you use iTerm, Warp, or another terminal app, add that app instead of Terminal. The key is to add whatever app you use to run the claudia command.</w:t>
             </w:r>
           </w:p>
         </w:tc>
@@ -2683,6 +2795,23 @@
     </w:tbl>
     <w:p>
       <w:pPr>
+        <w:spacing w:after="120"/>
+      </w:pPr>
+    </w:p>
+    <w:p>
+      <w:pPr>
+        <w:pStyle w:val="Heading2"/>
+      </w:pPr>
+      <w:r>
+        <w:rPr>
+          <w:b/>
+          <w:bCs/>
+        </w:rPr>
+        <w:t xml:space="preserve">Permission 2: Microphone (Automatic)</w:t>
+      </w:r>
+    </w:p>
+    <w:p>
+      <w:pPr>
         <w:spacing w:after="200" w:line="276"/>
       </w:pPr>
       <w:r>
@@ -2691,7 +2820,7 @@
           <w:sz w:val="22"/>
           <w:szCs w:val="22"/>
         </w:rPr>
-        <w:t xml:space="preserve">You will see a welcome banner and two things will appear:</w:t>
+        <w:t xml:space="preserve">The first time Claudia tries to listen to your microphone, macOS will show a pop-up asking for permission. Just click Allow. You only have to do this once.</w:t>
       </w:r>
     </w:p>
     <w:p>
@@ -2701,78 +2830,28 @@
     </w:p>
     <w:p>
       <w:pPr>
-        <w:pStyle w:val="ListParagraph"/>
-        <w:numPr>
-          <w:ilvl w:val="0"/>
-          <w:numId w:val="2"/>
-        </w:numPr>
-        <w:spacing w:after="120" w:line="276"/>
-      </w:pPr>
-      <w:r>
-        <w:rPr>
-          <w:rFonts w:ascii="Arial" w:cs="Arial" w:eastAsia="Arial" w:hAnsi="Arial"/>
+        <w:pStyle w:val="Heading1"/>
+      </w:pPr>
+      <w:r>
+        <w:rPr>
           <w:b/>
           <w:bCs/>
         </w:rPr>
-        <w:t xml:space="preserve">A microphone icon in your menu bar </w:t>
-      </w:r>
+        <w:t xml:space="preserve">5. Starting Claudia</w:t>
+      </w:r>
+    </w:p>
+    <w:p>
+      <w:pPr>
+        <w:spacing w:after="200" w:line="276"/>
+      </w:pPr>
       <w:r>
         <w:rPr>
           <w:rFonts w:ascii="Arial" w:cs="Arial" w:eastAsia="Arial" w:hAnsi="Arial"/>
           <w:sz w:val="22"/>
           <w:szCs w:val="22"/>
         </w:rPr>
-        <w:t xml:space="preserve">(the strip at the top of your screen, near the clock). It looks like a small microphone symbol.</w:t>
-      </w:r>
-    </w:p>
-    <w:p>
-      <w:pPr>
-        <w:pStyle w:val="ListParagraph"/>
-        <w:numPr>
-          <w:ilvl w:val="0"/>
-          <w:numId w:val="2"/>
-        </w:numPr>
-        <w:spacing w:after="120" w:line="276"/>
-      </w:pPr>
-      <w:r>
-        <w:rPr>
-          <w:rFonts w:ascii="Arial" w:cs="Arial" w:eastAsia="Arial" w:hAnsi="Arial"/>
-          <w:b/>
-          <w:bCs/>
-        </w:rPr>
-        <w:t xml:space="preserve">A floating microphone button </w:t>
-      </w:r>
-      <w:r>
-        <w:rPr>
-          <w:rFonts w:ascii="Arial" w:cs="Arial" w:eastAsia="Arial" w:hAnsi="Arial"/>
-          <w:sz w:val="22"/>
-          <w:szCs w:val="22"/>
-        </w:rPr>
-        <w:t xml:space="preserve">on the left side of your screen. This is a small, round, gray circle. You can drag it anywhere you like.</w:t>
-      </w:r>
-    </w:p>
-    <w:p>
-      <w:pPr>
-        <w:spacing w:after="120"/>
-      </w:pPr>
-    </w:p>
-    <w:p>
-      <w:pPr>
-        <w:spacing w:after="200" w:line="276"/>
-      </w:pPr>
-      <w:r>
-        <w:rPr>
-          <w:rFonts w:ascii="Arial" w:cs="Arial" w:eastAsia="Arial" w:hAnsi="Arial"/>
-          <w:sz w:val="22"/>
-          <w:szCs w:val="22"/>
-        </w:rPr>
-        <w:t xml:space="preserve">Claudia is now running and ready to listen whenever you click the microphone.</w:t>
-      </w:r>
-    </w:p>
-    <w:p>
-      <w:pPr>
-        <w:spacing w:after="120"/>
-      </w:pPr>
+        <w:t xml:space="preserve">Open Terminal and type:</w:t>
+      </w:r>
     </w:p>
     <w:tbl>
       <w:tblPr>
@@ -2795,46 +2874,30 @@
             <w:tcW w:type="dxa" w:w="9360"/>
             <w:tcBorders>
               <w:top w:val="none" w:color="FFFFFF" w:sz="0"/>
-              <w:left w:val="single" w:color="2E86C1" w:sz="12"/>
+              <w:left w:val="none" w:color="FFFFFF" w:sz="0"/>
               <w:bottom w:val="none" w:color="FFFFFF" w:sz="0"/>
               <w:right w:val="none" w:color="FFFFFF" w:sz="0"/>
             </w:tcBorders>
-            <w:shd w:fill="D6EAF8" w:val="clear"/>
-            <w:tcMar>
-              <w:top w:type="dxa" w:w="120"/>
+            <w:shd w:fill="2C3E50" w:val="clear"/>
+            <w:tcMar>
+              <w:top w:type="dxa" w:w="100"/>
               <w:left w:type="dxa" w:w="200"/>
-              <w:bottom w:type="dxa" w:w="120"/>
+              <w:bottom w:type="dxa" w:w="100"/>
               <w:right w:type="dxa" w:w="200"/>
             </w:tcMar>
           </w:tcPr>
           <w:p>
             <w:pPr>
-              <w:spacing w:after="80"/>
-            </w:pPr>
-            <w:r>
-              <w:rPr>
-                <w:rFonts w:ascii="Arial" w:cs="Arial" w:eastAsia="Arial" w:hAnsi="Arial"/>
-                <w:b/>
-                <w:bCs/>
-                <w:color w:val="1B4F72"/>
-                <w:sz w:val="22"/>
-                <w:szCs w:val="22"/>
-              </w:rPr>
-              <w:t xml:space="preserve">To stop Claudia</w:t>
-            </w:r>
-          </w:p>
-          <w:p>
-            <w:pPr>
-              <w:spacing w:after="0"/>
-            </w:pPr>
-            <w:r>
-              <w:rPr>
-                <w:rFonts w:ascii="Arial" w:cs="Arial" w:eastAsia="Arial" w:hAnsi="Arial"/>
-                <w:color w:val="2C3E50"/>
-                <w:sz w:val="21"/>
-                <w:szCs w:val="21"/>
-              </w:rPr>
-              <w:t xml:space="preserve">Press Ctrl+C in the Terminal window, or click the menubar icon and choose Quit Claudia.</w:t>
+              <w:spacing w:after="0"/>
+            </w:pPr>
+            <w:r>
+              <w:rPr>
+                <w:rFonts w:ascii="Courier New" w:cs="Courier New" w:eastAsia="Courier New" w:hAnsi="Courier New"/>
+                <w:color w:val="F0F0F0"/>
+                <w:sz w:val="20"/>
+                <w:szCs w:val="20"/>
+              </w:rPr>
+              <w:t xml:space="preserve">claudia</w:t>
             </w:r>
           </w:p>
         </w:tc>
@@ -2842,57 +2905,64 @@
     </w:tbl>
     <w:p>
       <w:pPr>
-        <w:pStyle w:val="Heading1"/>
-        <w:pageBreakBefore/>
-      </w:pPr>
-      <w:r>
-        <w:rPr>
+        <w:spacing w:after="200" w:line="276"/>
+      </w:pPr>
+      <w:r>
+        <w:rPr>
+          <w:rFonts w:ascii="Arial" w:cs="Arial" w:eastAsia="Arial" w:hAnsi="Arial"/>
+          <w:sz w:val="22"/>
+          <w:szCs w:val="22"/>
+        </w:rPr>
+        <w:t xml:space="preserve">You will see a welcome banner and two things will appear:</w:t>
+      </w:r>
+    </w:p>
+    <w:p>
+      <w:pPr>
+        <w:spacing w:after="120"/>
+      </w:pPr>
+    </w:p>
+    <w:p>
+      <w:pPr>
+        <w:pStyle w:val="ListParagraph"/>
+        <w:numPr>
+          <w:ilvl w:val="0"/>
+          <w:numId w:val="2"/>
+        </w:numPr>
+        <w:spacing w:after="120" w:line="276"/>
+      </w:pPr>
+      <w:r>
+        <w:rPr>
+          <w:rFonts w:ascii="Arial" w:cs="Arial" w:eastAsia="Arial" w:hAnsi="Arial"/>
           <w:b/>
           <w:bCs/>
         </w:rPr>
-        <w:t xml:space="preserve">6. How to Use It (The Fun Part)</w:t>
-      </w:r>
-    </w:p>
-    <w:p>
-      <w:pPr>
-        <w:spacing w:after="200" w:line="276"/>
-      </w:pPr>
+        <w:t xml:space="preserve">A microphone icon in your menu bar </w:t>
+      </w:r>
       <w:r>
         <w:rPr>
           <w:rFonts w:ascii="Arial" w:cs="Arial" w:eastAsia="Arial" w:hAnsi="Arial"/>
           <w:sz w:val="22"/>
           <w:szCs w:val="22"/>
         </w:rPr>
-        <w:t xml:space="preserve">Using Claudia takes four simple steps:</w:t>
-      </w:r>
-    </w:p>
-    <w:p>
-      <w:pPr>
-        <w:spacing w:after="120"/>
-      </w:pPr>
-    </w:p>
-    <w:p>
-      <w:pPr>
-        <w:spacing w:after="200" w:line="276"/>
+        <w:t xml:space="preserve">(the strip at the top of your screen, near the clock). It looks like a small microphone symbol.</w:t>
+      </w:r>
+    </w:p>
+    <w:p>
+      <w:pPr>
+        <w:pStyle w:val="ListParagraph"/>
+        <w:numPr>
+          <w:ilvl w:val="0"/>
+          <w:numId w:val="2"/>
+        </w:numPr>
+        <w:spacing w:after="120" w:line="276"/>
       </w:pPr>
       <w:r>
         <w:rPr>
           <w:rFonts w:ascii="Arial" w:cs="Arial" w:eastAsia="Arial" w:hAnsi="Arial"/>
           <w:b/>
           <w:bCs/>
-          <w:color w:val="2E86C1"/>
-          <w:sz w:val="24"/>
-          <w:szCs w:val="24"/>
-        </w:rPr>
-        <w:t xml:space="preserve">Step 1: </w:t>
-      </w:r>
-      <w:r>
-        <w:rPr>
-          <w:rFonts w:ascii="Arial" w:cs="Arial" w:eastAsia="Arial" w:hAnsi="Arial"/>
-          <w:b/>
-          <w:bCs/>
-        </w:rPr>
-        <w:t xml:space="preserve">Click the floating microphone button.</w:t>
+        </w:rPr>
+        <w:t xml:space="preserve">A floating microphone button </w:t>
       </w:r>
       <w:r>
         <w:rPr>
@@ -2900,7 +2970,7 @@
           <w:sz w:val="22"/>
           <w:szCs w:val="22"/>
         </w:rPr>
-        <w:t xml:space="preserve"> It turns red, which means Claudia is listening.</w:t>
+        <w:t xml:space="preserve">on the left side of your screen. This is a small, round, gray circle. You can drag it anywhere you like.</w:t>
       </w:r>
     </w:p>
     <w:p>
@@ -2912,106 +2982,13 @@
       <w:pPr>
         <w:spacing w:after="200" w:line="276"/>
       </w:pPr>
-      <w:r>
-        <w:rPr>
-          <w:rFonts w:ascii="Arial" w:cs="Arial" w:eastAsia="Arial" w:hAnsi="Arial"/>
-          <w:b/>
-          <w:bCs/>
-          <w:color w:val="2E86C1"/>
-          <w:sz w:val="24"/>
-          <w:szCs w:val="24"/>
-        </w:rPr>
-        <w:t xml:space="preserve">Step 2: </w:t>
-      </w:r>
-      <w:r>
-        <w:rPr>
-          <w:rFonts w:ascii="Arial" w:cs="Arial" w:eastAsia="Arial" w:hAnsi="Arial"/>
-          <w:b/>
-          <w:bCs/>
-        </w:rPr>
-        <w:t xml:space="preserve">Speak out loud in your normal voice.</w:t>
-      </w:r>
       <w:r>
         <w:rPr>
           <w:rFonts w:ascii="Arial" w:cs="Arial" w:eastAsia="Arial" w:hAnsi="Arial"/>
           <w:sz w:val="22"/>
           <w:szCs w:val="22"/>
         </w:rPr>
-        <w:t xml:space="preserve"> Talk at a natural pace, just like you would talk to a friend. Claudia will pick up everything you say.</w:t>
-      </w:r>
-    </w:p>
-    <w:p>
-      <w:pPr>
-        <w:spacing w:after="120"/>
-      </w:pPr>
-    </w:p>
-    <w:p>
-      <w:pPr>
-        <w:spacing w:after="200" w:line="276"/>
-      </w:pPr>
-      <w:r>
-        <w:rPr>
-          <w:rFonts w:ascii="Arial" w:cs="Arial" w:eastAsia="Arial" w:hAnsi="Arial"/>
-          <w:b/>
-          <w:bCs/>
-          <w:color w:val="2E86C1"/>
-          <w:sz w:val="24"/>
-          <w:szCs w:val="24"/>
-        </w:rPr>
-        <w:t xml:space="preserve">Step 3: </w:t>
-      </w:r>
-      <w:r>
-        <w:rPr>
-          <w:rFonts w:ascii="Arial" w:cs="Arial" w:eastAsia="Arial" w:hAnsi="Arial"/>
-          <w:b/>
-          <w:bCs/>
-        </w:rPr>
-        <w:t xml:space="preserve">Click the microphone button again.</w:t>
-      </w:r>
-      <w:r>
-        <w:rPr>
-          <w:rFonts w:ascii="Arial" w:cs="Arial" w:eastAsia="Arial" w:hAnsi="Arial"/>
-          <w:sz w:val="22"/>
-          <w:szCs w:val="22"/>
-        </w:rPr>
-        <w:t xml:space="preserve"> It turns blue for a moment (that means Claudia is turning your speech into text), then turns green (done!).</w:t>
-      </w:r>
-    </w:p>
-    <w:p>
-      <w:pPr>
-        <w:spacing w:after="120"/>
-      </w:pPr>
-    </w:p>
-    <w:p>
-      <w:pPr>
-        <w:spacing w:after="200" w:line="276"/>
-      </w:pPr>
-      <w:r>
-        <w:rPr>
-          <w:rFonts w:ascii="Arial" w:cs="Arial" w:eastAsia="Arial" w:hAnsi="Arial"/>
-          <w:b/>
-          <w:bCs/>
-          <w:color w:val="2E86C1"/>
-          <w:sz w:val="24"/>
-          <w:szCs w:val="24"/>
-        </w:rPr>
-        <w:t xml:space="preserve">Step 4: </w:t>
-      </w:r>
-      <w:r>
-        <w:rPr>
-          <w:rFonts w:ascii="Arial" w:cs="Arial" w:eastAsia="Arial" w:hAnsi="Arial"/>
-          <w:b/>
-          <w:bCs/>
-        </w:rPr>
-        <w:t xml:space="preserve">Your words appear as text</w:t>
-      </w:r>
-      <w:r>
-        <w:rPr>
-          <w:rFonts w:ascii="Arial" w:cs="Arial" w:eastAsia="Arial" w:hAnsi="Arial"/>
-          <w:sz w:val="22"/>
-          <w:szCs w:val="22"/>
-        </w:rPr>
-        <w:t xml:space="preserve"> in whatever app had focus — Cowork, Chrome, a text editor, anything. Look at the text. Fix any mistakes if you want. Then press Enter to send it.</w:t>
+        <w:t xml:space="preserve">Claudia is now running and ready to listen whenever you click the microphone.</w:t>
       </w:r>
     </w:p>
     <w:p>
@@ -3065,7 +3042,7 @@
                 <w:sz w:val="22"/>
                 <w:szCs w:val="22"/>
               </w:rPr>
-              <w:t xml:space="preserve">Pro Tip</w:t>
+              <w:t xml:space="preserve">To stop Claudia</w:t>
             </w:r>
           </w:p>
           <w:p>
@@ -3079,12 +3056,186 @@
                 <w:sz w:val="21"/>
                 <w:szCs w:val="21"/>
               </w:rPr>
-              <w:t xml:space="preserve">Before you click the mic, click once on the text box where you want the text to appear. Claudia pastes into whatever window is active when it finishes transcribing. If you’re using Cowork, click the Cowork input box first, then click the mic.</w:t>
+              <w:t xml:space="preserve">Press Ctrl+C in the Terminal window, or click the menubar icon and choose Quit Claudia.</w:t>
             </w:r>
           </w:p>
         </w:tc>
       </w:tr>
     </w:tbl>
+    <w:p>
+      <w:pPr>
+        <w:pStyle w:val="Heading1"/>
+        <w:pageBreakBefore/>
+      </w:pPr>
+      <w:r>
+        <w:rPr>
+          <w:b/>
+          <w:bCs/>
+        </w:rPr>
+        <w:t xml:space="preserve">6. How to Use It (The Fun Part)</w:t>
+      </w:r>
+    </w:p>
+    <w:p>
+      <w:pPr>
+        <w:spacing w:after="200" w:line="276"/>
+      </w:pPr>
+      <w:r>
+        <w:rPr>
+          <w:rFonts w:ascii="Arial" w:cs="Arial" w:eastAsia="Arial" w:hAnsi="Arial"/>
+          <w:sz w:val="22"/>
+          <w:szCs w:val="22"/>
+        </w:rPr>
+        <w:t xml:space="preserve">Using Claudia takes four simple steps:</w:t>
+      </w:r>
+    </w:p>
+    <w:p>
+      <w:pPr>
+        <w:spacing w:after="120"/>
+      </w:pPr>
+    </w:p>
+    <w:p>
+      <w:pPr>
+        <w:spacing w:after="200" w:line="276"/>
+      </w:pPr>
+      <w:r>
+        <w:rPr>
+          <w:rFonts w:ascii="Arial" w:cs="Arial" w:eastAsia="Arial" w:hAnsi="Arial"/>
+          <w:b/>
+          <w:bCs/>
+          <w:color w:val="2E86C1"/>
+          <w:sz w:val="24"/>
+          <w:szCs w:val="24"/>
+        </w:rPr>
+        <w:t xml:space="preserve">Step 1: </w:t>
+      </w:r>
+      <w:r>
+        <w:rPr>
+          <w:rFonts w:ascii="Arial" w:cs="Arial" w:eastAsia="Arial" w:hAnsi="Arial"/>
+          <w:b/>
+          <w:bCs/>
+        </w:rPr>
+        <w:t xml:space="preserve">Click the floating microphone button.</w:t>
+      </w:r>
+      <w:r>
+        <w:rPr>
+          <w:rFonts w:ascii="Arial" w:cs="Arial" w:eastAsia="Arial" w:hAnsi="Arial"/>
+          <w:sz w:val="22"/>
+          <w:szCs w:val="22"/>
+        </w:rPr>
+        <w:t xml:space="preserve"> It turns red, which means Claudia is listening.</w:t>
+      </w:r>
+    </w:p>
+    <w:p>
+      <w:pPr>
+        <w:spacing w:after="120"/>
+      </w:pPr>
+    </w:p>
+    <w:p>
+      <w:pPr>
+        <w:spacing w:after="200" w:line="276"/>
+      </w:pPr>
+      <w:r>
+        <w:rPr>
+          <w:rFonts w:ascii="Arial" w:cs="Arial" w:eastAsia="Arial" w:hAnsi="Arial"/>
+          <w:b/>
+          <w:bCs/>
+          <w:color w:val="2E86C1"/>
+          <w:sz w:val="24"/>
+          <w:szCs w:val="24"/>
+        </w:rPr>
+        <w:t xml:space="preserve">Step 2: </w:t>
+      </w:r>
+      <w:r>
+        <w:rPr>
+          <w:rFonts w:ascii="Arial" w:cs="Arial" w:eastAsia="Arial" w:hAnsi="Arial"/>
+          <w:b/>
+          <w:bCs/>
+        </w:rPr>
+        <w:t xml:space="preserve">Speak out loud in your normal voice.</w:t>
+      </w:r>
+      <w:r>
+        <w:rPr>
+          <w:rFonts w:ascii="Arial" w:cs="Arial" w:eastAsia="Arial" w:hAnsi="Arial"/>
+          <w:sz w:val="22"/>
+          <w:szCs w:val="22"/>
+        </w:rPr>
+        <w:t xml:space="preserve"> Talk at a natural pace, just like you would talk to a friend. Claudia will pick up everything you say.</w:t>
+      </w:r>
+    </w:p>
+    <w:p>
+      <w:pPr>
+        <w:spacing w:after="120"/>
+      </w:pPr>
+    </w:p>
+    <w:p>
+      <w:pPr>
+        <w:spacing w:after="200" w:line="276"/>
+      </w:pPr>
+      <w:r>
+        <w:rPr>
+          <w:rFonts w:ascii="Arial" w:cs="Arial" w:eastAsia="Arial" w:hAnsi="Arial"/>
+          <w:b/>
+          <w:bCs/>
+          <w:color w:val="2E86C1"/>
+          <w:sz w:val="24"/>
+          <w:szCs w:val="24"/>
+        </w:rPr>
+        <w:t xml:space="preserve">Step 3: </w:t>
+      </w:r>
+      <w:r>
+        <w:rPr>
+          <w:rFonts w:ascii="Arial" w:cs="Arial" w:eastAsia="Arial" w:hAnsi="Arial"/>
+          <w:b/>
+          <w:bCs/>
+        </w:rPr>
+        <w:t xml:space="preserve">Click the microphone button again.</w:t>
+      </w:r>
+      <w:r>
+        <w:rPr>
+          <w:rFonts w:ascii="Arial" w:cs="Arial" w:eastAsia="Arial" w:hAnsi="Arial"/>
+          <w:sz w:val="22"/>
+          <w:szCs w:val="22"/>
+        </w:rPr>
+        <w:t xml:space="preserve"> It turns blue for a moment (that means Claudia is turning your speech into text), then turns green (done!).</w:t>
+      </w:r>
+    </w:p>
+    <w:p>
+      <w:pPr>
+        <w:spacing w:after="120"/>
+      </w:pPr>
+    </w:p>
+    <w:p>
+      <w:pPr>
+        <w:spacing w:after="200" w:line="276"/>
+      </w:pPr>
+      <w:r>
+        <w:rPr>
+          <w:rFonts w:ascii="Arial" w:cs="Arial" w:eastAsia="Arial" w:hAnsi="Arial"/>
+          <w:b/>
+          <w:bCs/>
+          <w:color w:val="2E86C1"/>
+          <w:sz w:val="24"/>
+          <w:szCs w:val="24"/>
+        </w:rPr>
+        <w:t xml:space="preserve">Step 4: </w:t>
+      </w:r>
+      <w:r>
+        <w:rPr>
+          <w:rFonts w:ascii="Arial" w:cs="Arial" w:eastAsia="Arial" w:hAnsi="Arial"/>
+          <w:b/>
+          <w:bCs/>
+        </w:rPr>
+        <w:t xml:space="preserve">Your words appear as text</w:t>
+      </w:r>
+      <w:r>
+        <w:rPr>
+          <w:rFonts w:ascii="Arial" w:cs="Arial" w:eastAsia="Arial" w:hAnsi="Arial"/>
+          <w:sz w:val="22"/>
+          <w:szCs w:val="22"/>
+        </w:rPr>
+        <w:t xml:space="preserve"> in whatever app you were using before you clicked the mic — Cowork, Chrome, a text editor, anything. Claudia remembers which app had focus, brings it back to front, and pastes right where your cursor was. Look at the text, fix any mistakes, and press Enter.</w:t>
+      </w:r>
+    </w:p>
     <w:p>
       <w:pPr>
         <w:spacing w:after="120"/>
@@ -3111,11 +3262,11 @@
             <w:tcW w:type="dxa" w:w="9360"/>
             <w:tcBorders>
               <w:top w:val="none" w:color="FFFFFF" w:sz="0"/>
-              <w:left w:val="single" w:color="D4740B" w:sz="12"/>
+              <w:left w:val="single" w:color="2E86C1" w:sz="12"/>
               <w:bottom w:val="none" w:color="FFFFFF" w:sz="0"/>
               <w:right w:val="none" w:color="FFFFFF" w:sz="0"/>
             </w:tcBorders>
-            <w:shd w:fill="FEF5E7" w:val="clear"/>
+            <w:shd w:fill="D6EAF8" w:val="clear"/>
             <w:tcMar>
               <w:top w:type="dxa" w:w="120"/>
               <w:left w:type="dxa" w:w="200"/>
@@ -3132,11 +3283,11 @@
                 <w:rFonts w:ascii="Arial" w:cs="Arial" w:eastAsia="Arial" w:hAnsi="Arial"/>
                 <w:b/>
                 <w:bCs/>
-                <w:color w:val="D4740B"/>
+                <w:color w:val="1B4F72"/>
                 <w:sz w:val="22"/>
                 <w:szCs w:val="22"/>
               </w:rPr>
-              <w:t xml:space="preserve">Important</w:t>
+              <w:t xml:space="preserve">How focus tracking works</w:t>
             </w:r>
           </w:p>
           <w:p>
@@ -3150,7 +3301,78 @@
                 <w:sz w:val="21"/>
                 <w:szCs w:val="21"/>
               </w:rPr>
-              <w:t xml:space="preserve">Do NOT click away from your target app while Claudia is transcribing (while the button is blue). The text will be pasted into whatever window is in front when transcription finishes.</w:t>
+              <w:t xml:space="preserve">Claudia continuously watches which app you’re using. When you click the floating mic, it already knows where you were — even though clicking the mic briefly shifts focus to the Claudia process. After transcription, it switches you back automatically. You don’t have to do anything special.</w:t>
+            </w:r>
+          </w:p>
+        </w:tc>
+      </w:tr>
+    </w:tbl>
+    <w:p>
+      <w:pPr>
+        <w:spacing w:after="120"/>
+      </w:pPr>
+    </w:p>
+    <w:tbl>
+      <w:tblPr>
+        <w:tblW w:type="dxa" w:w="9360"/>
+        <w:tblBorders>
+          <w:top w:val="single" w:color="auto" w:sz="4"/>
+          <w:left w:val="single" w:color="auto" w:sz="4"/>
+          <w:bottom w:val="single" w:color="auto" w:sz="4"/>
+          <w:right w:val="single" w:color="auto" w:sz="4"/>
+          <w:insideH w:val="single" w:color="auto" w:sz="4"/>
+          <w:insideV w:val="single" w:color="auto" w:sz="4"/>
+        </w:tblBorders>
+      </w:tblPr>
+      <w:tblGrid>
+        <w:gridCol w:w="9360"/>
+      </w:tblGrid>
+      <w:tr>
+        <w:tc>
+          <w:tcPr>
+            <w:tcW w:type="dxa" w:w="9360"/>
+            <w:tcBorders>
+              <w:top w:val="none" w:color="FFFFFF" w:sz="0"/>
+              <w:left w:val="single" w:color="2E86C1" w:sz="12"/>
+              <w:bottom w:val="none" w:color="FFFFFF" w:sz="0"/>
+              <w:right w:val="none" w:color="FFFFFF" w:sz="0"/>
+            </w:tcBorders>
+            <w:shd w:fill="D6EAF8" w:val="clear"/>
+            <w:tcMar>
+              <w:top w:type="dxa" w:w="120"/>
+              <w:left w:type="dxa" w:w="200"/>
+              <w:bottom w:type="dxa" w:w="120"/>
+              <w:right w:type="dxa" w:w="200"/>
+            </w:tcMar>
+          </w:tcPr>
+          <w:p>
+            <w:pPr>
+              <w:spacing w:after="80"/>
+            </w:pPr>
+            <w:r>
+              <w:rPr>
+                <w:rFonts w:ascii="Arial" w:cs="Arial" w:eastAsia="Arial" w:hAnsi="Arial"/>
+                <w:b/>
+                <w:bCs/>
+                <w:color w:val="1B4F72"/>
+                <w:sz w:val="22"/>
+                <w:szCs w:val="22"/>
+              </w:rPr>
+              <w:t xml:space="preserve">Pro Tip</w:t>
+            </w:r>
+          </w:p>
+          <w:p>
+            <w:pPr>
+              <w:spacing w:after="0"/>
+            </w:pPr>
+            <w:r>
+              <w:rPr>
+                <w:rFonts w:ascii="Arial" w:cs="Arial" w:eastAsia="Arial" w:hAnsi="Arial"/>
+                <w:color w:val="2C3E50"/>
+                <w:sz w:val="21"/>
+                <w:szCs w:val="21"/>
+              </w:rPr>
+              <w:t xml:space="preserve">Before you click the mic, click once on the text box where you want the text to appear. Claudia brings your app back to front after transcribing, so the text lands right where your cursor was blinking.</w:t>
             </w:r>
           </w:p>
         </w:tc>
@@ -4082,7 +4304,7 @@
                 <w:sz w:val="20"/>
                 <w:szCs w:val="20"/>
               </w:rPr>
-              <w:t xml:space="preserve">base (default)</w:t>
+              <w:t xml:space="preserve">base</w:t>
             </w:r>
           </w:p>
         </w:tc>
@@ -4178,7 +4400,7 @@
                 <w:sz w:val="20"/>
                 <w:szCs w:val="20"/>
               </w:rPr>
-              <w:t xml:space="preserve">Good — best everyday choice</w:t>
+              <w:t xml:space="preserve">Good — fast drafts where speed matters most</w:t>
             </w:r>
           </w:p>
         </w:tc>
@@ -4212,7 +4434,7 @@
                 <w:sz w:val="20"/>
                 <w:szCs w:val="20"/>
               </w:rPr>
-              <w:t xml:space="preserve">small</w:t>
+              <w:t xml:space="preserve">small (default)</w:t>
             </w:r>
           </w:p>
         </w:tc>
@@ -4276,7 +4498,7 @@
                 <w:sz w:val="20"/>
                 <w:szCs w:val="20"/>
               </w:rPr>
-              <w:t xml:space="preserve">Medium</w:t>
+              <w:t xml:space="preserve">Moderate</w:t>
             </w:r>
           </w:p>
         </w:tc>
@@ -4308,7 +4530,7 @@
                 <w:sz w:val="20"/>
                 <w:szCs w:val="20"/>
               </w:rPr>
-              <w:t xml:space="preserve">Better — for important docs</w:t>
+              <w:t xml:space="preserve">Better — best balance of speed and accuracy</w:t>
             </w:r>
           </w:p>
         </w:tc>
@@ -4589,7 +4811,7 @@
           <w:sz w:val="22"/>
           <w:szCs w:val="22"/>
         </w:rPr>
-        <w:t xml:space="preserve">The default model (base) is a great choice for most people. To switch models, stop Claudia (Ctrl+C) and restart with:</w:t>
+        <w:t xml:space="preserve">The default model (small) gives the best balance of speed and accuracy. It’s noticeably better than base at recognizing proper nouns and technical vocabulary, while still fast enough on Apple Silicon (1–2 seconds for a 10-second clip). To switch models, stop Claudia (Ctrl+C) and restart with:</w:t>
       </w:r>
     </w:p>
     <w:tbl>
@@ -4669,7 +4891,7 @@
           <w:b/>
           <w:bCs/>
         </w:rPr>
-        <w:t xml:space="preserve">9. Using Cloud Transcription (Optional)</w:t>
+        <w:t xml:space="preserve">9. Teaching Claudia Your Words (Vocabulary Hints)</w:t>
       </w:r>
     </w:p>
     <w:p>
@@ -4682,7 +4904,25 @@
           <w:sz w:val="22"/>
           <w:szCs w:val="22"/>
         </w:rPr>
-        <w:t xml:space="preserve">By default, Claudia processes your voice entirely on your Mac. Nothing leaves your computer. But if you want even faster and more accurate results, you can use a cloud service called Groq.</w:t>
+        <w:t xml:space="preserve">Whisper is excellent at common words, but it sometimes misspells proper nouns it hasn’t seen before. For example, it might hear “Severin” and write “Severn,” or hear “ePraxis” and write “e-praxis.”</w:t>
+      </w:r>
+    </w:p>
+    <w:p>
+      <w:pPr>
+        <w:spacing w:after="120"/>
+      </w:pPr>
+    </w:p>
+    <w:p>
+      <w:pPr>
+        <w:spacing w:after="200" w:line="276"/>
+      </w:pPr>
+      <w:r>
+        <w:rPr>
+          <w:rFonts w:ascii="Arial" w:cs="Arial" w:eastAsia="Arial" w:hAnsi="Arial"/>
+          <w:sz w:val="22"/>
+          <w:szCs w:val="22"/>
+        </w:rPr>
+        <w:t xml:space="preserve">Claudia solves this with vocabulary hints. You give it a list of words you say often, and it “primes” the Whisper model to expect those exact spellings.</w:t>
       </w:r>
     </w:p>
     <w:p>
@@ -4700,129 +4940,7 @@
           <w:b/>
           <w:bCs/>
         </w:rPr>
-        <w:t xml:space="preserve">What is Groq? </w:t>
-      </w:r>
-      <w:r>
-        <w:rPr>
-          <w:rFonts w:ascii="Arial" w:cs="Arial" w:eastAsia="Arial" w:hAnsi="Arial"/>
-          <w:sz w:val="22"/>
-          <w:szCs w:val="22"/>
-        </w:rPr>
-        <w:t xml:space="preserve">Groq is a company that runs the Whisper speech model on super-fast special chips. It transcribes speech 216 times faster than real-time — meaning a 10-second recording is transcribed in about 0.05 seconds. It’s essentially instant.</w:t>
-      </w:r>
-    </w:p>
-    <w:p>
-      <w:pPr>
-        <w:spacing w:after="120"/>
-      </w:pPr>
-    </w:p>
-    <w:p>
-      <w:pPr>
-        <w:spacing w:after="200" w:line="276"/>
-      </w:pPr>
-      <w:r>
-        <w:rPr>
-          <w:rFonts w:ascii="Arial" w:cs="Arial" w:eastAsia="Arial" w:hAnsi="Arial"/>
-          <w:b/>
-          <w:bCs/>
-        </w:rPr>
-        <w:t xml:space="preserve">How to set it up:</w:t>
-      </w:r>
-    </w:p>
-    <w:p>
-      <w:pPr>
-        <w:spacing w:after="120"/>
-      </w:pPr>
-    </w:p>
-    <w:p>
-      <w:pPr>
-        <w:spacing w:after="200" w:line="276"/>
-      </w:pPr>
-      <w:r>
-        <w:rPr>
-          <w:rFonts w:ascii="Arial" w:cs="Arial" w:eastAsia="Arial" w:hAnsi="Arial"/>
-          <w:b/>
-          <w:bCs/>
-          <w:color w:val="2E86C1"/>
-          <w:sz w:val="24"/>
-          <w:szCs w:val="24"/>
-        </w:rPr>
-        <w:t xml:space="preserve">Step 1: </w:t>
-      </w:r>
-      <w:r>
-        <w:rPr>
-          <w:rFonts w:ascii="Arial" w:cs="Arial" w:eastAsia="Arial" w:hAnsi="Arial"/>
-          <w:sz w:val="22"/>
-          <w:szCs w:val="22"/>
-        </w:rPr>
-        <w:t xml:space="preserve">Go to </w:t>
-      </w:r>
-      <w:hyperlink w:history="1" r:id="rIdbgqp2oovumv3zh7mainxq">
-        <w:r>
-          <w:rPr>
-            <w:rStyle w:val="Hyperlink"/>
-            <w:rFonts w:ascii="Arial" w:cs="Arial" w:eastAsia="Arial" w:hAnsi="Arial"/>
-            <w:sz w:val="22"/>
-            <w:szCs w:val="22"/>
-          </w:rPr>
-          <w:t xml:space="preserve">console.groq.com</w:t>
-        </w:r>
-      </w:hyperlink>
-      <w:r>
-        <w:rPr>
-          <w:rFonts w:ascii="Arial" w:cs="Arial" w:eastAsia="Arial" w:hAnsi="Arial"/>
-          <w:sz w:val="22"/>
-          <w:szCs w:val="22"/>
-        </w:rPr>
-        <w:t xml:space="preserve"> and create a free account.</w:t>
-      </w:r>
-    </w:p>
-    <w:p>
-      <w:pPr>
-        <w:spacing w:after="200" w:line="276"/>
-      </w:pPr>
-      <w:r>
-        <w:rPr>
-          <w:rFonts w:ascii="Arial" w:cs="Arial" w:eastAsia="Arial" w:hAnsi="Arial"/>
-          <w:b/>
-          <w:bCs/>
-          <w:color w:val="2E86C1"/>
-          <w:sz w:val="24"/>
-          <w:szCs w:val="24"/>
-        </w:rPr>
-        <w:t xml:space="preserve">Step 2: </w:t>
-      </w:r>
-      <w:r>
-        <w:rPr>
-          <w:rFonts w:ascii="Arial" w:cs="Arial" w:eastAsia="Arial" w:hAnsi="Arial"/>
-          <w:sz w:val="22"/>
-          <w:szCs w:val="22"/>
-        </w:rPr>
-        <w:t xml:space="preserve">Create an API key (a long secret code that proves it’s you).</w:t>
-      </w:r>
-    </w:p>
-    <w:p>
-      <w:pPr>
-        <w:spacing w:after="200" w:line="276"/>
-      </w:pPr>
-      <w:r>
-        <w:rPr>
-          <w:rFonts w:ascii="Arial" w:cs="Arial" w:eastAsia="Arial" w:hAnsi="Arial"/>
-          <w:b/>
-          <w:bCs/>
-          <w:color w:val="2E86C1"/>
-          <w:sz w:val="24"/>
-          <w:szCs w:val="24"/>
-        </w:rPr>
-        <w:t xml:space="preserve">Step 3: </w:t>
-      </w:r>
-      <w:r>
-        <w:rPr>
-          <w:rFonts w:ascii="Arial" w:cs="Arial" w:eastAsia="Arial" w:hAnsi="Arial"/>
-          <w:sz w:val="22"/>
-          <w:szCs w:val="22"/>
-        </w:rPr>
-        <w:t xml:space="preserve">In Terminal, type this (replacing your-key-here with your actual key):</w:t>
+        <w:t xml:space="preserve">Default vocabulary (ships with Claudia):</w:t>
       </w:r>
     </w:p>
     <w:tbl>
@@ -4869,7 +4987,7 @@
                 <w:sz w:val="20"/>
                 <w:szCs w:val="20"/>
               </w:rPr>
-              <w:t xml:space="preserve">export CLAUDIA_GROQ_API_KEY=your-key-here</w:t>
+              <w:t xml:space="preserve">Severin, Sorensen, ePraxis, Arete, AreteCoach, AIWhisperer, Claudia Chatterley, Cowork, Vistage</w:t>
             </w:r>
           </w:p>
         </w:tc>
@@ -4877,6 +4995,11 @@
     </w:tbl>
     <w:p>
       <w:pPr>
+        <w:spacing w:after="120"/>
+      </w:pPr>
+    </w:p>
+    <w:p>
+      <w:pPr>
         <w:spacing w:after="200" w:line="276"/>
       </w:pPr>
       <w:r>
@@ -4884,11 +5007,8 @@
           <w:rFonts w:ascii="Arial" w:cs="Arial" w:eastAsia="Arial" w:hAnsi="Arial"/>
           <w:b/>
           <w:bCs/>
-          <w:color w:val="2E86C1"/>
-          <w:sz w:val="24"/>
-          <w:szCs w:val="24"/>
-        </w:rPr>
-        <w:t xml:space="preserve">Step 4: </w:t>
+        </w:rPr>
+        <w:t xml:space="preserve">To add your own words:</w:t>
       </w:r>
       <w:r>
         <w:rPr>
@@ -4896,7 +5016,7 @@
           <w:sz w:val="22"/>
           <w:szCs w:val="22"/>
         </w:rPr>
-        <w:t xml:space="preserve">Start Claudia with the cloud engine:</w:t>
+        <w:t xml:space="preserve"> Open the config file in any text editor:</w:t>
       </w:r>
     </w:p>
     <w:tbl>
@@ -4943,7 +5063,7 @@
                 <w:sz w:val="20"/>
                 <w:szCs w:val="20"/>
               </w:rPr>
-              <w:t xml:space="preserve">claudia --engine groq</w:t>
+              <w:t xml:space="preserve">open ~/.claudia/config.json</w:t>
             </w:r>
           </w:p>
         </w:tc>
@@ -4953,6 +5073,19 @@
       <w:pPr>
         <w:spacing w:after="120"/>
       </w:pPr>
+    </w:p>
+    <w:p>
+      <w:pPr>
+        <w:spacing w:after="200" w:line="276"/>
+      </w:pPr>
+      <w:r>
+        <w:rPr>
+          <w:rFonts w:ascii="Arial" w:cs="Arial" w:eastAsia="Arial" w:hAnsi="Arial"/>
+          <w:sz w:val="22"/>
+          <w:szCs w:val="22"/>
+        </w:rPr>
+        <w:t xml:space="preserve">Find the “vocabulary” list inside the “transcription” section. Add your words:</w:t>
+      </w:r>
     </w:p>
     <w:tbl>
       <w:tblPr>
@@ -4975,6 +5108,465 @@
             <w:tcW w:type="dxa" w:w="9360"/>
             <w:tcBorders>
               <w:top w:val="none" w:color="FFFFFF" w:sz="0"/>
+              <w:left w:val="none" w:color="FFFFFF" w:sz="0"/>
+              <w:bottom w:val="none" w:color="FFFFFF" w:sz="0"/>
+              <w:right w:val="none" w:color="FFFFFF" w:sz="0"/>
+            </w:tcBorders>
+            <w:shd w:fill="2C3E50" w:val="clear"/>
+            <w:tcMar>
+              <w:top w:type="dxa" w:w="100"/>
+              <w:left w:type="dxa" w:w="200"/>
+              <w:bottom w:type="dxa" w:w="100"/>
+              <w:right w:type="dxa" w:w="200"/>
+            </w:tcMar>
+          </w:tcPr>
+          <w:p>
+            <w:pPr>
+              <w:spacing w:after="0"/>
+            </w:pPr>
+            <w:r>
+              <w:rPr>
+                <w:rFonts w:ascii="Courier New" w:cs="Courier New" w:eastAsia="Courier New" w:hAnsi="Courier New"/>
+                <w:color w:val="F0F0F0"/>
+                <w:sz w:val="20"/>
+                <w:szCs w:val="20"/>
+              </w:rPr>
+              <w:t xml:space="preserve">"vocabulary": [
+  "Severin", "Sorensen", "ePraxis",
+  "YourCompany", "YourProduct", "AnyProperNoun"
+]</w:t>
+            </w:r>
+          </w:p>
+        </w:tc>
+      </w:tr>
+    </w:tbl>
+    <w:p>
+      <w:pPr>
+        <w:spacing w:after="120"/>
+      </w:pPr>
+    </w:p>
+    <w:p>
+      <w:pPr>
+        <w:spacing w:after="200" w:line="276"/>
+      </w:pPr>
+      <w:r>
+        <w:rPr>
+          <w:rFonts w:ascii="Arial" w:cs="Arial" w:eastAsia="Arial" w:hAnsi="Arial"/>
+          <w:sz w:val="22"/>
+          <w:szCs w:val="22"/>
+        </w:rPr>
+        <w:t xml:space="preserve">Save the file and restart Claudia. No reinstall needed — just Ctrl+C and type </w:t>
+      </w:r>
+      <w:r>
+        <w:rPr>
+          <w:rFonts w:ascii="Courier New" w:cs="Courier New" w:eastAsia="Courier New" w:hAnsi="Courier New"/>
+          <w:color w:val="2C3E50"/>
+          <w:sz w:val="20"/>
+          <w:szCs w:val="20"/>
+          <w:shd w:fill="F2F3F4" w:val="clear"/>
+        </w:rPr>
+        <w:t xml:space="preserve">claudia</w:t>
+      </w:r>
+      <w:r>
+        <w:rPr>
+          <w:rFonts w:ascii="Arial" w:cs="Arial" w:eastAsia="Arial" w:hAnsi="Arial"/>
+          <w:sz w:val="22"/>
+          <w:szCs w:val="22"/>
+        </w:rPr>
+        <w:t xml:space="preserve"> again.</w:t>
+      </w:r>
+    </w:p>
+    <w:p>
+      <w:pPr>
+        <w:spacing w:after="120"/>
+      </w:pPr>
+    </w:p>
+    <w:tbl>
+      <w:tblPr>
+        <w:tblW w:type="dxa" w:w="9360"/>
+        <w:tblBorders>
+          <w:top w:val="single" w:color="auto" w:sz="4"/>
+          <w:left w:val="single" w:color="auto" w:sz="4"/>
+          <w:bottom w:val="single" w:color="auto" w:sz="4"/>
+          <w:right w:val="single" w:color="auto" w:sz="4"/>
+          <w:insideH w:val="single" w:color="auto" w:sz="4"/>
+          <w:insideV w:val="single" w:color="auto" w:sz="4"/>
+        </w:tblBorders>
+      </w:tblPr>
+      <w:tblGrid>
+        <w:gridCol w:w="9360"/>
+      </w:tblGrid>
+      <w:tr>
+        <w:tc>
+          <w:tcPr>
+            <w:tcW w:type="dxa" w:w="9360"/>
+            <w:tcBorders>
+              <w:top w:val="none" w:color="FFFFFF" w:sz="0"/>
+              <w:left w:val="single" w:color="2E86C1" w:sz="12"/>
+              <w:bottom w:val="none" w:color="FFFFFF" w:sz="0"/>
+              <w:right w:val="none" w:color="FFFFFF" w:sz="0"/>
+            </w:tcBorders>
+            <w:shd w:fill="D6EAF8" w:val="clear"/>
+            <w:tcMar>
+              <w:top w:type="dxa" w:w="120"/>
+              <w:left w:type="dxa" w:w="200"/>
+              <w:bottom w:type="dxa" w:w="120"/>
+              <w:right w:type="dxa" w:w="200"/>
+            </w:tcMar>
+          </w:tcPr>
+          <w:p>
+            <w:pPr>
+              <w:spacing w:after="80"/>
+            </w:pPr>
+            <w:r>
+              <w:rPr>
+                <w:rFonts w:ascii="Arial" w:cs="Arial" w:eastAsia="Arial" w:hAnsi="Arial"/>
+                <w:b/>
+                <w:bCs/>
+                <w:color w:val="1B4F72"/>
+                <w:sz w:val="22"/>
+                <w:szCs w:val="22"/>
+              </w:rPr>
+              <w:t xml:space="preserve">What kind of words should I add?</w:t>
+            </w:r>
+          </w:p>
+          <w:p>
+            <w:pPr>
+              <w:spacing w:after="0"/>
+            </w:pPr>
+            <w:r>
+              <w:rPr>
+                <w:rFonts w:ascii="Arial" w:cs="Arial" w:eastAsia="Arial" w:hAnsi="Arial"/>
+                <w:color w:val="2C3E50"/>
+                <w:sz w:val="21"/>
+                <w:szCs w:val="21"/>
+              </w:rPr>
+              <w:t xml:space="preserve">Names of people, companies, products, brands, technical terms, acronyms — anything Whisper might not know. The more specific the word, the more it helps. Common English words don’t need to be added.</w:t>
+            </w:r>
+          </w:p>
+        </w:tc>
+      </w:tr>
+    </w:tbl>
+    <w:p>
+      <w:pPr>
+        <w:spacing w:after="120"/>
+      </w:pPr>
+    </w:p>
+    <w:p>
+      <w:pPr>
+        <w:pStyle w:val="Heading1"/>
+      </w:pPr>
+      <w:r>
+        <w:rPr>
+          <w:b/>
+          <w:bCs/>
+        </w:rPr>
+        <w:t xml:space="preserve">10. Using Cloud Transcription (Optional)</w:t>
+      </w:r>
+    </w:p>
+    <w:p>
+      <w:pPr>
+        <w:spacing w:after="200" w:line="276"/>
+      </w:pPr>
+      <w:r>
+        <w:rPr>
+          <w:rFonts w:ascii="Arial" w:cs="Arial" w:eastAsia="Arial" w:hAnsi="Arial"/>
+          <w:sz w:val="22"/>
+          <w:szCs w:val="22"/>
+        </w:rPr>
+        <w:t xml:space="preserve">By default, Claudia processes your voice entirely on your Mac. Nothing leaves your computer. But if you want even faster and more accurate results, you can use a cloud service called Groq.</w:t>
+      </w:r>
+    </w:p>
+    <w:p>
+      <w:pPr>
+        <w:spacing w:after="120"/>
+      </w:pPr>
+    </w:p>
+    <w:p>
+      <w:pPr>
+        <w:spacing w:after="200" w:line="276"/>
+      </w:pPr>
+      <w:r>
+        <w:rPr>
+          <w:rFonts w:ascii="Arial" w:cs="Arial" w:eastAsia="Arial" w:hAnsi="Arial"/>
+          <w:b/>
+          <w:bCs/>
+        </w:rPr>
+        <w:t xml:space="preserve">What is Groq? </w:t>
+      </w:r>
+      <w:r>
+        <w:rPr>
+          <w:rFonts w:ascii="Arial" w:cs="Arial" w:eastAsia="Arial" w:hAnsi="Arial"/>
+          <w:sz w:val="22"/>
+          <w:szCs w:val="22"/>
+        </w:rPr>
+        <w:t xml:space="preserve">Groq is a company that runs the Whisper speech model on super-fast special chips. It transcribes speech 216 times faster than real-time — meaning a 10-second recording is transcribed in about 0.05 seconds. It’s essentially instant.</w:t>
+      </w:r>
+    </w:p>
+    <w:p>
+      <w:pPr>
+        <w:spacing w:after="120"/>
+      </w:pPr>
+    </w:p>
+    <w:p>
+      <w:pPr>
+        <w:spacing w:after="200" w:line="276"/>
+      </w:pPr>
+      <w:r>
+        <w:rPr>
+          <w:rFonts w:ascii="Arial" w:cs="Arial" w:eastAsia="Arial" w:hAnsi="Arial"/>
+          <w:b/>
+          <w:bCs/>
+        </w:rPr>
+        <w:t xml:space="preserve">How to set it up:</w:t>
+      </w:r>
+    </w:p>
+    <w:p>
+      <w:pPr>
+        <w:spacing w:after="120"/>
+      </w:pPr>
+    </w:p>
+    <w:p>
+      <w:pPr>
+        <w:spacing w:after="200" w:line="276"/>
+      </w:pPr>
+      <w:r>
+        <w:rPr>
+          <w:rFonts w:ascii="Arial" w:cs="Arial" w:eastAsia="Arial" w:hAnsi="Arial"/>
+          <w:b/>
+          <w:bCs/>
+          <w:color w:val="2E86C1"/>
+          <w:sz w:val="24"/>
+          <w:szCs w:val="24"/>
+        </w:rPr>
+        <w:t xml:space="preserve">Step 1: </w:t>
+      </w:r>
+      <w:r>
+        <w:rPr>
+          <w:rFonts w:ascii="Arial" w:cs="Arial" w:eastAsia="Arial" w:hAnsi="Arial"/>
+          <w:sz w:val="22"/>
+          <w:szCs w:val="22"/>
+        </w:rPr>
+        <w:t xml:space="preserve">Go to </w:t>
+      </w:r>
+      <w:hyperlink w:history="1" r:id="rIdash02zcs6vkgvsa02ajh8">
+        <w:r>
+          <w:rPr>
+            <w:rStyle w:val="Hyperlink"/>
+            <w:rFonts w:ascii="Arial" w:cs="Arial" w:eastAsia="Arial" w:hAnsi="Arial"/>
+            <w:sz w:val="22"/>
+            <w:szCs w:val="22"/>
+          </w:rPr>
+          <w:t xml:space="preserve">console.groq.com</w:t>
+        </w:r>
+      </w:hyperlink>
+      <w:r>
+        <w:rPr>
+          <w:rFonts w:ascii="Arial" w:cs="Arial" w:eastAsia="Arial" w:hAnsi="Arial"/>
+          <w:sz w:val="22"/>
+          <w:szCs w:val="22"/>
+        </w:rPr>
+        <w:t xml:space="preserve"> and create a free account.</w:t>
+      </w:r>
+    </w:p>
+    <w:p>
+      <w:pPr>
+        <w:spacing w:after="200" w:line="276"/>
+      </w:pPr>
+      <w:r>
+        <w:rPr>
+          <w:rFonts w:ascii="Arial" w:cs="Arial" w:eastAsia="Arial" w:hAnsi="Arial"/>
+          <w:b/>
+          <w:bCs/>
+          <w:color w:val="2E86C1"/>
+          <w:sz w:val="24"/>
+          <w:szCs w:val="24"/>
+        </w:rPr>
+        <w:t xml:space="preserve">Step 2: </w:t>
+      </w:r>
+      <w:r>
+        <w:rPr>
+          <w:rFonts w:ascii="Arial" w:cs="Arial" w:eastAsia="Arial" w:hAnsi="Arial"/>
+          <w:sz w:val="22"/>
+          <w:szCs w:val="22"/>
+        </w:rPr>
+        <w:t xml:space="preserve">Create an API key (a long secret code that proves it’s you).</w:t>
+      </w:r>
+    </w:p>
+    <w:p>
+      <w:pPr>
+        <w:spacing w:after="200" w:line="276"/>
+      </w:pPr>
+      <w:r>
+        <w:rPr>
+          <w:rFonts w:ascii="Arial" w:cs="Arial" w:eastAsia="Arial" w:hAnsi="Arial"/>
+          <w:b/>
+          <w:bCs/>
+          <w:color w:val="2E86C1"/>
+          <w:sz w:val="24"/>
+          <w:szCs w:val="24"/>
+        </w:rPr>
+        <w:t xml:space="preserve">Step 3: </w:t>
+      </w:r>
+      <w:r>
+        <w:rPr>
+          <w:rFonts w:ascii="Arial" w:cs="Arial" w:eastAsia="Arial" w:hAnsi="Arial"/>
+          <w:sz w:val="22"/>
+          <w:szCs w:val="22"/>
+        </w:rPr>
+        <w:t xml:space="preserve">In Terminal, type this (replacing your-key-here with your actual key):</w:t>
+      </w:r>
+    </w:p>
+    <w:tbl>
+      <w:tblPr>
+        <w:tblW w:type="dxa" w:w="9360"/>
+        <w:tblBorders>
+          <w:top w:val="single" w:color="auto" w:sz="4"/>
+          <w:left w:val="single" w:color="auto" w:sz="4"/>
+          <w:bottom w:val="single" w:color="auto" w:sz="4"/>
+          <w:right w:val="single" w:color="auto" w:sz="4"/>
+          <w:insideH w:val="single" w:color="auto" w:sz="4"/>
+          <w:insideV w:val="single" w:color="auto" w:sz="4"/>
+        </w:tblBorders>
+      </w:tblPr>
+      <w:tblGrid>
+        <w:gridCol w:w="9360"/>
+      </w:tblGrid>
+      <w:tr>
+        <w:tc>
+          <w:tcPr>
+            <w:tcW w:type="dxa" w:w="9360"/>
+            <w:tcBorders>
+              <w:top w:val="none" w:color="FFFFFF" w:sz="0"/>
+              <w:left w:val="none" w:color="FFFFFF" w:sz="0"/>
+              <w:bottom w:val="none" w:color="FFFFFF" w:sz="0"/>
+              <w:right w:val="none" w:color="FFFFFF" w:sz="0"/>
+            </w:tcBorders>
+            <w:shd w:fill="2C3E50" w:val="clear"/>
+            <w:tcMar>
+              <w:top w:type="dxa" w:w="100"/>
+              <w:left w:type="dxa" w:w="200"/>
+              <w:bottom w:type="dxa" w:w="100"/>
+              <w:right w:type="dxa" w:w="200"/>
+            </w:tcMar>
+          </w:tcPr>
+          <w:p>
+            <w:pPr>
+              <w:spacing w:after="0"/>
+            </w:pPr>
+            <w:r>
+              <w:rPr>
+                <w:rFonts w:ascii="Courier New" w:cs="Courier New" w:eastAsia="Courier New" w:hAnsi="Courier New"/>
+                <w:color w:val="F0F0F0"/>
+                <w:sz w:val="20"/>
+                <w:szCs w:val="20"/>
+              </w:rPr>
+              <w:t xml:space="preserve">export CLAUDIA_GROQ_API_KEY=your-key-here</w:t>
+            </w:r>
+          </w:p>
+        </w:tc>
+      </w:tr>
+    </w:tbl>
+    <w:p>
+      <w:pPr>
+        <w:spacing w:after="200" w:line="276"/>
+      </w:pPr>
+      <w:r>
+        <w:rPr>
+          <w:rFonts w:ascii="Arial" w:cs="Arial" w:eastAsia="Arial" w:hAnsi="Arial"/>
+          <w:b/>
+          <w:bCs/>
+          <w:color w:val="2E86C1"/>
+          <w:sz w:val="24"/>
+          <w:szCs w:val="24"/>
+        </w:rPr>
+        <w:t xml:space="preserve">Step 4: </w:t>
+      </w:r>
+      <w:r>
+        <w:rPr>
+          <w:rFonts w:ascii="Arial" w:cs="Arial" w:eastAsia="Arial" w:hAnsi="Arial"/>
+          <w:sz w:val="22"/>
+          <w:szCs w:val="22"/>
+        </w:rPr>
+        <w:t xml:space="preserve">Start Claudia with the cloud engine:</w:t>
+      </w:r>
+    </w:p>
+    <w:tbl>
+      <w:tblPr>
+        <w:tblW w:type="dxa" w:w="9360"/>
+        <w:tblBorders>
+          <w:top w:val="single" w:color="auto" w:sz="4"/>
+          <w:left w:val="single" w:color="auto" w:sz="4"/>
+          <w:bottom w:val="single" w:color="auto" w:sz="4"/>
+          <w:right w:val="single" w:color="auto" w:sz="4"/>
+          <w:insideH w:val="single" w:color="auto" w:sz="4"/>
+          <w:insideV w:val="single" w:color="auto" w:sz="4"/>
+        </w:tblBorders>
+      </w:tblPr>
+      <w:tblGrid>
+        <w:gridCol w:w="9360"/>
+      </w:tblGrid>
+      <w:tr>
+        <w:tc>
+          <w:tcPr>
+            <w:tcW w:type="dxa" w:w="9360"/>
+            <w:tcBorders>
+              <w:top w:val="none" w:color="FFFFFF" w:sz="0"/>
+              <w:left w:val="none" w:color="FFFFFF" w:sz="0"/>
+              <w:bottom w:val="none" w:color="FFFFFF" w:sz="0"/>
+              <w:right w:val="none" w:color="FFFFFF" w:sz="0"/>
+            </w:tcBorders>
+            <w:shd w:fill="2C3E50" w:val="clear"/>
+            <w:tcMar>
+              <w:top w:type="dxa" w:w="100"/>
+              <w:left w:type="dxa" w:w="200"/>
+              <w:bottom w:type="dxa" w:w="100"/>
+              <w:right w:type="dxa" w:w="200"/>
+            </w:tcMar>
+          </w:tcPr>
+          <w:p>
+            <w:pPr>
+              <w:spacing w:after="0"/>
+            </w:pPr>
+            <w:r>
+              <w:rPr>
+                <w:rFonts w:ascii="Courier New" w:cs="Courier New" w:eastAsia="Courier New" w:hAnsi="Courier New"/>
+                <w:color w:val="F0F0F0"/>
+                <w:sz w:val="20"/>
+                <w:szCs w:val="20"/>
+              </w:rPr>
+              <w:t xml:space="preserve">claudia --engine groq</w:t>
+            </w:r>
+          </w:p>
+        </w:tc>
+      </w:tr>
+    </w:tbl>
+    <w:p>
+      <w:pPr>
+        <w:spacing w:after="120"/>
+      </w:pPr>
+    </w:p>
+    <w:tbl>
+      <w:tblPr>
+        <w:tblW w:type="dxa" w:w="9360"/>
+        <w:tblBorders>
+          <w:top w:val="single" w:color="auto" w:sz="4"/>
+          <w:left w:val="single" w:color="auto" w:sz="4"/>
+          <w:bottom w:val="single" w:color="auto" w:sz="4"/>
+          <w:right w:val="single" w:color="auto" w:sz="4"/>
+          <w:insideH w:val="single" w:color="auto" w:sz="4"/>
+          <w:insideV w:val="single" w:color="auto" w:sz="4"/>
+        </w:tblBorders>
+      </w:tblPr>
+      <w:tblGrid>
+        <w:gridCol w:w="9360"/>
+      </w:tblGrid>
+      <w:tr>
+        <w:tc>
+          <w:tcPr>
+            <w:tcW w:type="dxa" w:w="9360"/>
+            <w:tcBorders>
+              <w:top w:val="none" w:color="FFFFFF" w:sz="0"/>
               <w:left w:val="single" w:color="D4740B" w:sz="12"/>
               <w:bottom w:val="none" w:color="FFFFFF" w:sz="0"/>
               <w:right w:val="none" w:color="FFFFFF" w:sz="0"/>
@@ -5030,7 +5622,7 @@
           <w:b/>
           <w:bCs/>
         </w:rPr>
-        <w:t xml:space="preserve">10. Changing Your Settings</w:t>
+        <w:t xml:space="preserve">11. Changing Your Settings</w:t>
       </w:r>
     </w:p>
     <w:p>
@@ -5438,7 +6030,7 @@
                 <w:sz w:val="20"/>
                 <w:szCs w:val="20"/>
               </w:rPr>
-              <w:t xml:space="preserve">"tiny", "base", "small", "medium", "large-v3"</w:t>
+              <w:t xml:space="preserve">"tiny", "base", "small" (default), "medium", "large-v3"</w:t>
             </w:r>
           </w:p>
         </w:tc>
@@ -6257,7 +6849,7 @@
           <w:b/>
           <w:bCs/>
         </w:rPr>
-        <w:t xml:space="preserve">11. All the Commands You Can Type</w:t>
+        <w:t xml:space="preserve">12. All the Commands You Can Type</w:t>
       </w:r>
     </w:p>
     <w:p>
@@ -7431,7 +8023,20 @@
           <w:b/>
           <w:bCs/>
         </w:rPr>
-        <w:t xml:space="preserve">12. Troubleshooting — When Things Go Wrong</w:t>
+        <w:t xml:space="preserve">13. Troubleshooting — When Things Go Wrong</w:t>
+      </w:r>
+    </w:p>
+    <w:p>
+      <w:pPr>
+        <w:spacing w:after="200" w:line="276"/>
+      </w:pPr>
+      <w:r>
+        <w:rPr>
+          <w:rFonts w:ascii="Arial" w:cs="Arial" w:eastAsia="Arial" w:hAnsi="Arial"/>
+          <w:sz w:val="22"/>
+          <w:szCs w:val="22"/>
+        </w:rPr>
+        <w:t xml:space="preserve">These are real problems we hit during installation and testing on a stock MacBook Pro. Every fix here was tested and verified.</w:t>
       </w:r>
     </w:p>
     <w:p>
@@ -7686,7 +8291,7 @@
           <w:b/>
           <w:bCs/>
         </w:rPr>
-        <w:t xml:space="preserve">Problem: Text appears in the wrong window</w:t>
+        <w:t xml:space="preserve">Problem: Text appears in Terminal instead of my app</w:t>
       </w:r>
     </w:p>
     <w:p>
@@ -7707,7 +8312,7 @@
           <w:sz w:val="22"/>
           <w:szCs w:val="22"/>
         </w:rPr>
-        <w:t xml:space="preserve">You clicked on a different window while Claudia was transcribing (blue phase). The text was pasted into whatever window was in front.</w:t>
+        <w:t xml:space="preserve">Claudia’s focus tracking couldn’t determine which app you were in. This can happen if you launch Claudia and immediately click the mic before switching to another app.</w:t>
       </w:r>
     </w:p>
     <w:p>
@@ -7728,7 +8333,7 @@
           <w:sz w:val="22"/>
           <w:szCs w:val="22"/>
         </w:rPr>
-        <w:t xml:space="preserve">Before clicking the mic, click on the text box where you want your words to appear. After clicking the mic and speaking, don’t click anywhere else until the text appears.</w:t>
+        <w:t xml:space="preserve">Click into the app where you want text to appear (Chrome, Cowork, etc.), wait a beat, then click the mic. Claudia continuously tracks which app has focus and will remember the last non-Terminal app you used.</w:t>
       </w:r>
     </w:p>
     <w:p>
@@ -7745,7 +8350,7 @@
           <w:b/>
           <w:bCs/>
         </w:rPr>
-        <w:t xml:space="preserve">Problem: Claudia doesn’t hear me / transcribes silence</w:t>
+        <w:t xml:space="preserve">Problem: “externally-managed-environment” error from pip</w:t>
       </w:r>
     </w:p>
     <w:p>
@@ -7758,7 +8363,7 @@
           <w:b/>
           <w:bCs/>
         </w:rPr>
-        <w:t xml:space="preserve">Fix: </w:t>
+        <w:t xml:space="preserve">What happened: </w:t>
       </w:r>
       <w:r>
         <w:rPr>
@@ -7766,17 +8371,20 @@
           <w:sz w:val="22"/>
           <w:szCs w:val="22"/>
         </w:rPr>
-        <w:t xml:space="preserve">Check that your microphone is working. Open System Settings &gt; Sound &gt; Input and speak — you should see the level bar move. If it doesn’t, select the correct input device. Then tell Claudia which device to use: </w:t>
-      </w:r>
-      <w:r>
-        <w:rPr>
-          <w:rFonts w:ascii="Courier New" w:cs="Courier New" w:eastAsia="Courier New" w:hAnsi="Courier New"/>
-          <w:color w:val="2C3E50"/>
-          <w:sz w:val="20"/>
-          <w:szCs w:val="20"/>
-          <w:shd w:fill="F2F3F4" w:val="clear"/>
-        </w:rPr>
-        <w:t xml:space="preserve">claudia --devices</w:t>
+        <w:t xml:space="preserve">Homebrew’s Python 3.12 uses a policy called PEP 668 that blocks system-wide pip installs. This is by design — it protects Homebrew’s Python from conflicts.</w:t>
+      </w:r>
+    </w:p>
+    <w:p>
+      <w:pPr>
+        <w:spacing w:after="200" w:line="276"/>
+      </w:pPr>
+      <w:r>
+        <w:rPr>
+          <w:rFonts w:ascii="Arial" w:cs="Arial" w:eastAsia="Arial" w:hAnsi="Arial"/>
+          <w:b/>
+          <w:bCs/>
+        </w:rPr>
+        <w:t xml:space="preserve">Fix: </w:t>
       </w:r>
       <w:r>
         <w:rPr>
@@ -7784,150 +8392,7 @@
           <w:sz w:val="22"/>
           <w:szCs w:val="22"/>
         </w:rPr>
-        <w:t xml:space="preserve"> to see the list, then </w:t>
-      </w:r>
-      <w:r>
-        <w:rPr>
-          <w:rFonts w:ascii="Courier New" w:cs="Courier New" w:eastAsia="Courier New" w:hAnsi="Courier New"/>
-          <w:color w:val="2C3E50"/>
-          <w:sz w:val="20"/>
-          <w:szCs w:val="20"/>
-          <w:shd w:fill="F2F3F4" w:val="clear"/>
-        </w:rPr>
-        <w:t xml:space="preserve">claudia --device 2</w:t>
-      </w:r>
-      <w:r>
-        <w:rPr>
-          <w:rFonts w:ascii="Arial" w:cs="Arial" w:eastAsia="Arial" w:hAnsi="Arial"/>
-          <w:sz w:val="22"/>
-          <w:szCs w:val="22"/>
-        </w:rPr>
-        <w:t xml:space="preserve"> (use the number of your working mic).</w:t>
-      </w:r>
-    </w:p>
-    <w:p>
-      <w:pPr>
-        <w:spacing w:after="120"/>
-      </w:pPr>
-    </w:p>
-    <w:p>
-      <w:pPr>
-        <w:pStyle w:val="Heading3"/>
-      </w:pPr>
-      <w:r>
-        <w:rPr>
-          <w:b/>
-          <w:bCs/>
-        </w:rPr>
-        <w:t xml:space="preserve">Problem: "pip: command not found"</w:t>
-      </w:r>
-    </w:p>
-    <w:p>
-      <w:pPr>
-        <w:spacing w:after="200" w:line="276"/>
-      </w:pPr>
-      <w:r>
-        <w:rPr>
-          <w:rFonts w:ascii="Arial" w:cs="Arial" w:eastAsia="Arial" w:hAnsi="Arial"/>
-          <w:b/>
-          <w:bCs/>
-        </w:rPr>
-        <w:t xml:space="preserve">Fix: </w:t>
-      </w:r>
-      <w:r>
-        <w:rPr>
-          <w:rFonts w:ascii="Arial" w:cs="Arial" w:eastAsia="Arial" w:hAnsi="Arial"/>
-          <w:sz w:val="22"/>
-          <w:szCs w:val="22"/>
-        </w:rPr>
-        <w:t xml:space="preserve">Try </w:t>
-      </w:r>
-      <w:r>
-        <w:rPr>
-          <w:rFonts w:ascii="Courier New" w:cs="Courier New" w:eastAsia="Courier New" w:hAnsi="Courier New"/>
-          <w:color w:val="2C3E50"/>
-          <w:sz w:val="20"/>
-          <w:szCs w:val="20"/>
-          <w:shd w:fill="F2F3F4" w:val="clear"/>
-        </w:rPr>
-        <w:t xml:space="preserve">pip3 install claudia-chatterley</w:t>
-      </w:r>
-      <w:r>
-        <w:rPr>
-          <w:rFonts w:ascii="Arial" w:cs="Arial" w:eastAsia="Arial" w:hAnsi="Arial"/>
-          <w:sz w:val="22"/>
-          <w:szCs w:val="22"/>
-        </w:rPr>
-        <w:t xml:space="preserve"> instead of pip. If that also fails, install Python with: </w:t>
-      </w:r>
-      <w:r>
-        <w:rPr>
-          <w:rFonts w:ascii="Courier New" w:cs="Courier New" w:eastAsia="Courier New" w:hAnsi="Courier New"/>
-          <w:color w:val="2C3E50"/>
-          <w:sz w:val="20"/>
-          <w:szCs w:val="20"/>
-          <w:shd w:fill="F2F3F4" w:val="clear"/>
-        </w:rPr>
-        <w:t xml:space="preserve">brew install python@3.12</w:t>
-      </w:r>
-    </w:p>
-    <w:p>
-      <w:pPr>
-        <w:spacing w:after="120"/>
-      </w:pPr>
-    </w:p>
-    <w:p>
-      <w:pPr>
-        <w:pStyle w:val="Heading3"/>
-      </w:pPr>
-      <w:r>
-        <w:rPr>
-          <w:b/>
-          <w:bCs/>
-        </w:rPr>
-        <w:t xml:space="preserve">Problem: "command not found: brew"</w:t>
-      </w:r>
-    </w:p>
-    <w:p>
-      <w:pPr>
-        <w:spacing w:after="200" w:line="276"/>
-      </w:pPr>
-      <w:r>
-        <w:rPr>
-          <w:rFonts w:ascii="Arial" w:cs="Arial" w:eastAsia="Arial" w:hAnsi="Arial"/>
-          <w:b/>
-          <w:bCs/>
-        </w:rPr>
-        <w:t xml:space="preserve">What happened: </w:t>
-      </w:r>
-      <w:r>
-        <w:rPr>
-          <w:rFonts w:ascii="Arial" w:cs="Arial" w:eastAsia="Arial" w:hAnsi="Arial"/>
-          <w:sz w:val="22"/>
-          <w:szCs w:val="22"/>
-        </w:rPr>
-        <w:t xml:space="preserve">Homebrew is not installed on your Mac. Most Macs don’t come with it.</w:t>
-      </w:r>
-    </w:p>
-    <w:p>
-      <w:pPr>
-        <w:spacing w:after="200" w:line="276"/>
-      </w:pPr>
-      <w:r>
-        <w:rPr>
-          <w:rFonts w:ascii="Arial" w:cs="Arial" w:eastAsia="Arial" w:hAnsi="Arial"/>
-          <w:b/>
-          <w:bCs/>
-        </w:rPr>
-        <w:t xml:space="preserve">Fix: </w:t>
-      </w:r>
-      <w:r>
-        <w:rPr>
-          <w:rFonts w:ascii="Arial" w:cs="Arial" w:eastAsia="Arial" w:hAnsi="Arial"/>
-          <w:sz w:val="22"/>
-          <w:szCs w:val="22"/>
-        </w:rPr>
-        <w:t xml:space="preserve">Run the smart installer from Chapter 3 (Option A). It will install Homebrew for you. Or install Homebrew manually by pasting this into Terminal:</w:t>
+        <w:t xml:space="preserve">Use pipx instead of pip. pipx creates an isolated environment for each app:</w:t>
       </w:r>
     </w:p>
     <w:tbl>
@@ -7974,7 +8439,8 @@
                 <w:sz w:val="20"/>
                 <w:szCs w:val="20"/>
               </w:rPr>
-              <w:t xml:space="preserve">/bin/bash -c "$(curl -fsSL https://raw.githubusercontent.com/Homebrew/install/HEAD/install.sh)"</w:t>
+              <w:t xml:space="preserve">brew install pipx
+pipx install git+https://github.com/sevsorensen/claudia-chatterley.git</w:t>
             </w:r>
           </w:p>
         </w:tc>
@@ -7982,47 +8448,142 @@
     </w:tbl>
     <w:p>
       <w:pPr>
+        <w:spacing w:after="120"/>
+      </w:pPr>
+    </w:p>
+    <w:p>
+      <w:pPr>
+        <w:pStyle w:val="Heading3"/>
+      </w:pPr>
+      <w:r>
+        <w:rPr>
+          <w:b/>
+          <w:bCs/>
+        </w:rPr>
+        <w:t xml:space="preserve">Problem: Changed settings but old values still apply</w:t>
+      </w:r>
+    </w:p>
+    <w:p>
+      <w:pPr>
         <w:spacing w:after="200" w:line="276"/>
       </w:pPr>
       <w:r>
         <w:rPr>
           <w:rFonts w:ascii="Arial" w:cs="Arial" w:eastAsia="Arial" w:hAnsi="Arial"/>
-          <w:i/>
-          <w:iCs/>
+          <w:b/>
+          <w:bCs/>
+        </w:rPr>
+        <w:t xml:space="preserve">What happened: </w:t>
+      </w:r>
+      <w:r>
+        <w:rPr>
+          <w:rFonts w:ascii="Arial" w:cs="Arial" w:eastAsia="Arial" w:hAnsi="Arial"/>
           <w:sz w:val="22"/>
           <w:szCs w:val="22"/>
         </w:rPr>
-        <w:t xml:space="preserve">After installing, close Terminal and open a new window for the brew command to work.</w:t>
-      </w:r>
-    </w:p>
-    <w:p>
-      <w:pPr>
-        <w:spacing w:after="120"/>
-      </w:pPr>
-    </w:p>
-    <w:p>
-      <w:pPr>
-        <w:pStyle w:val="Heading3"/>
-      </w:pPr>
-      <w:r>
-        <w:rPr>
+        <w:t xml:space="preserve">Your config file (~/.claudia/config.json) was created during first run and saves the settings from that moment. Updating Claudia’s code doesn’t change your saved config.</w:t>
+      </w:r>
+    </w:p>
+    <w:p>
+      <w:pPr>
+        <w:spacing w:after="200" w:line="276"/>
+      </w:pPr>
+      <w:r>
+        <w:rPr>
+          <w:rFonts w:ascii="Arial" w:cs="Arial" w:eastAsia="Arial" w:hAnsi="Arial"/>
           <w:b/>
           <w:bCs/>
         </w:rPr>
-        <w:t xml:space="preserve">Problem: "Python 3.10+ required (found 3.9)"</w:t>
-      </w:r>
-    </w:p>
-    <w:p>
-      <w:pPr>
-        <w:spacing w:after="200" w:line="276"/>
-      </w:pPr>
-      <w:r>
-        <w:rPr>
-          <w:rFonts w:ascii="Arial" w:cs="Arial" w:eastAsia="Arial" w:hAnsi="Arial"/>
+        <w:t xml:space="preserve">Fix: </w:t>
+      </w:r>
+      <w:r>
+        <w:rPr>
+          <w:rFonts w:ascii="Arial" w:cs="Arial" w:eastAsia="Arial" w:hAnsi="Arial"/>
+          <w:sz w:val="22"/>
+          <w:szCs w:val="22"/>
+        </w:rPr>
+        <w:t xml:space="preserve">Delete the config file and let Claudia recreate it with the new defaults:</w:t>
+      </w:r>
+    </w:p>
+    <w:tbl>
+      <w:tblPr>
+        <w:tblW w:type="dxa" w:w="9360"/>
+        <w:tblBorders>
+          <w:top w:val="single" w:color="auto" w:sz="4"/>
+          <w:left w:val="single" w:color="auto" w:sz="4"/>
+          <w:bottom w:val="single" w:color="auto" w:sz="4"/>
+          <w:right w:val="single" w:color="auto" w:sz="4"/>
+          <w:insideH w:val="single" w:color="auto" w:sz="4"/>
+          <w:insideV w:val="single" w:color="auto" w:sz="4"/>
+        </w:tblBorders>
+      </w:tblPr>
+      <w:tblGrid>
+        <w:gridCol w:w="9360"/>
+      </w:tblGrid>
+      <w:tr>
+        <w:tc>
+          <w:tcPr>
+            <w:tcW w:type="dxa" w:w="9360"/>
+            <w:tcBorders>
+              <w:top w:val="none" w:color="FFFFFF" w:sz="0"/>
+              <w:left w:val="none" w:color="FFFFFF" w:sz="0"/>
+              <w:bottom w:val="none" w:color="FFFFFF" w:sz="0"/>
+              <w:right w:val="none" w:color="FFFFFF" w:sz="0"/>
+            </w:tcBorders>
+            <w:shd w:fill="2C3E50" w:val="clear"/>
+            <w:tcMar>
+              <w:top w:type="dxa" w:w="100"/>
+              <w:left w:type="dxa" w:w="200"/>
+              <w:bottom w:type="dxa" w:w="100"/>
+              <w:right w:type="dxa" w:w="200"/>
+            </w:tcMar>
+          </w:tcPr>
+          <w:p>
+            <w:pPr>
+              <w:spacing w:after="0"/>
+            </w:pPr>
+            <w:r>
+              <w:rPr>
+                <w:rFonts w:ascii="Courier New" w:cs="Courier New" w:eastAsia="Courier New" w:hAnsi="Courier New"/>
+                <w:color w:val="F0F0F0"/>
+                <w:sz w:val="20"/>
+                <w:szCs w:val="20"/>
+              </w:rPr>
+              <w:t xml:space="preserve">rm ~/.claudia/config.json
+claudia</w:t>
+            </w:r>
+          </w:p>
+        </w:tc>
+      </w:tr>
+    </w:tbl>
+    <w:p>
+      <w:pPr>
+        <w:spacing w:after="120"/>
+      </w:pPr>
+    </w:p>
+    <w:p>
+      <w:pPr>
+        <w:pStyle w:val="Heading3"/>
+      </w:pPr>
+      <w:r>
+        <w:rPr>
           <w:b/>
           <w:bCs/>
         </w:rPr>
-        <w:t xml:space="preserve">What happened: </w:t>
+        <w:t xml:space="preserve">Problem: Claudia doesn’t hear me / transcribes silence</w:t>
+      </w:r>
+    </w:p>
+    <w:p>
+      <w:pPr>
+        <w:spacing w:after="200" w:line="276"/>
+      </w:pPr>
+      <w:r>
+        <w:rPr>
+          <w:rFonts w:ascii="Arial" w:cs="Arial" w:eastAsia="Arial" w:hAnsi="Arial"/>
+          <w:b/>
+          <w:bCs/>
+        </w:rPr>
+        <w:t xml:space="preserve">Fix: </w:t>
       </w:r>
       <w:r>
         <w:rPr>
@@ -8030,28 +8591,7 @@
           <w:sz w:val="22"/>
           <w:szCs w:val="22"/>
         </w:rPr>
-        <w:t xml:space="preserve">Your Mac has an older version of Python that came pre-installed with macOS. Claudia needs a newer version.</w:t>
-      </w:r>
-    </w:p>
-    <w:p>
-      <w:pPr>
-        <w:spacing w:after="200" w:line="276"/>
-      </w:pPr>
-      <w:r>
-        <w:rPr>
-          <w:rFonts w:ascii="Arial" w:cs="Arial" w:eastAsia="Arial" w:hAnsi="Arial"/>
-          <w:b/>
-          <w:bCs/>
-        </w:rPr>
-        <w:t xml:space="preserve">Fix: </w:t>
-      </w:r>
-      <w:r>
-        <w:rPr>
-          <w:rFonts w:ascii="Arial" w:cs="Arial" w:eastAsia="Arial" w:hAnsi="Arial"/>
-          <w:sz w:val="22"/>
-          <w:szCs w:val="22"/>
-        </w:rPr>
-        <w:t xml:space="preserve">Install a newer Python with: </w:t>
+        <w:t xml:space="preserve">Check that your microphone is working. Open System Settings &gt; Sound &gt; Input and speak — you should see the level bar move. If it doesn’t, select the correct input device. Then tell Claudia which device to use: </w:t>
       </w:r>
       <w:r>
         <w:rPr>
@@ -8061,7 +8601,7 @@
           <w:szCs w:val="20"/>
           <w:shd w:fill="F2F3F4" w:val="clear"/>
         </w:rPr>
-        <w:t xml:space="preserve">brew install python@3.12</w:t>
+        <w:t xml:space="preserve">claudia --devices</w:t>
       </w:r>
       <w:r>
         <w:rPr>
@@ -8069,113 +8609,7 @@
           <w:sz w:val="22"/>
           <w:szCs w:val="22"/>
         </w:rPr>
-        <w:t xml:space="preserve">. This does NOT replace your old Python — it adds a new one alongside it. Then restart Claudia.</w:t>
-      </w:r>
-    </w:p>
-    <w:p>
-      <w:pPr>
-        <w:pStyle w:val="Heading1"/>
-        <w:pageBreakBefore/>
-      </w:pPr>
-      <w:r>
-        <w:rPr>
-          <w:b/>
-          <w:bCs/>
-        </w:rPr>
-        <w:t xml:space="preserve">13. Frequently Asked Questions</w:t>
-      </w:r>
-    </w:p>
-    <w:p>
-      <w:pPr>
-        <w:spacing w:after="120"/>
-      </w:pPr>
-    </w:p>
-    <w:p>
-      <w:pPr>
-        <w:spacing w:after="200" w:line="276"/>
-      </w:pPr>
-      <w:r>
-        <w:rPr>
-          <w:rFonts w:ascii="Arial" w:cs="Arial" w:eastAsia="Arial" w:hAnsi="Arial"/>
-          <w:b/>
-          <w:bCs/>
-        </w:rPr>
-        <w:t xml:space="preserve">Q: Does Claudia send my voice to the internet?</w:t>
-      </w:r>
-    </w:p>
-    <w:p>
-      <w:pPr>
-        <w:spacing w:after="200" w:line="276"/>
-      </w:pPr>
-      <w:r>
-        <w:rPr>
-          <w:rFonts w:ascii="Arial" w:cs="Arial" w:eastAsia="Arial" w:hAnsi="Arial"/>
-          <w:sz w:val="22"/>
-          <w:szCs w:val="22"/>
-        </w:rPr>
-        <w:t xml:space="preserve">A: Not by default. In local mode (the default), everything stays on your Mac. Only if you choose to use Groq cloud mode does audio leave your computer.</w:t>
-      </w:r>
-    </w:p>
-    <w:p>
-      <w:pPr>
-        <w:spacing w:after="120"/>
-      </w:pPr>
-    </w:p>
-    <w:p>
-      <w:pPr>
-        <w:spacing w:after="200" w:line="276"/>
-      </w:pPr>
-      <w:r>
-        <w:rPr>
-          <w:rFonts w:ascii="Arial" w:cs="Arial" w:eastAsia="Arial" w:hAnsi="Arial"/>
-          <w:b/>
-          <w:bCs/>
-        </w:rPr>
-        <w:t xml:space="preserve">Q: Does Claudia work in apps other than Cowork?</w:t>
-      </w:r>
-    </w:p>
-    <w:p>
-      <w:pPr>
-        <w:spacing w:after="200" w:line="276"/>
-      </w:pPr>
-      <w:r>
-        <w:rPr>
-          <w:rFonts w:ascii="Arial" w:cs="Arial" w:eastAsia="Arial" w:hAnsi="Arial"/>
-          <w:sz w:val="22"/>
-          <w:szCs w:val="22"/>
-        </w:rPr>
-        <w:t xml:space="preserve">A: Yes! Claudia works in any app on your Mac — Chrome, Safari, Notes, Word, Slack, Terminal, anything that accepts text. It works at the operating system level, not inside any single app.</w:t>
-      </w:r>
-    </w:p>
-    <w:p>
-      <w:pPr>
-        <w:spacing w:after="120"/>
-      </w:pPr>
-    </w:p>
-    <w:p>
-      <w:pPr>
-        <w:spacing w:after="200" w:line="276"/>
-      </w:pPr>
-      <w:r>
-        <w:rPr>
-          <w:rFonts w:ascii="Arial" w:cs="Arial" w:eastAsia="Arial" w:hAnsi="Arial"/>
-          <w:b/>
-          <w:bCs/>
-        </w:rPr>
-        <w:t xml:space="preserve">Q: Can Claudia understand languages other than English?</w:t>
-      </w:r>
-    </w:p>
-    <w:p>
-      <w:pPr>
-        <w:spacing w:after="200" w:line="276"/>
-      </w:pPr>
-      <w:r>
-        <w:rPr>
-          <w:rFonts w:ascii="Arial" w:cs="Arial" w:eastAsia="Arial" w:hAnsi="Arial"/>
-          <w:sz w:val="22"/>
-          <w:szCs w:val="22"/>
-        </w:rPr>
-        <w:t xml:space="preserve">A: Yes. Whisper supports dozens of languages. Use </w:t>
+        <w:t xml:space="preserve"> to see the list, then </w:t>
       </w:r>
       <w:r>
         <w:rPr>
@@ -8185,7 +8619,7 @@
           <w:szCs w:val="20"/>
           <w:shd w:fill="F2F3F4" w:val="clear"/>
         </w:rPr>
-        <w:t xml:space="preserve">claudia --language es</w:t>
+        <w:t xml:space="preserve">claudia --device 2</w:t>
       </w:r>
       <w:r>
         <w:rPr>
@@ -8193,7 +8627,192 @@
           <w:sz w:val="22"/>
           <w:szCs w:val="22"/>
         </w:rPr>
-        <w:t xml:space="preserve"> for Spanish, </w:t>
+        <w:t xml:space="preserve"> (use the number of your working mic).</w:t>
+      </w:r>
+    </w:p>
+    <w:p>
+      <w:pPr>
+        <w:spacing w:after="120"/>
+      </w:pPr>
+    </w:p>
+    <w:p>
+      <w:pPr>
+        <w:pStyle w:val="Heading3"/>
+      </w:pPr>
+      <w:r>
+        <w:rPr>
+          <w:b/>
+          <w:bCs/>
+        </w:rPr>
+        <w:t xml:space="preserve">Problem: Whisper misspells my name or company</w:t>
+      </w:r>
+    </w:p>
+    <w:p>
+      <w:pPr>
+        <w:spacing w:after="200" w:line="276"/>
+      </w:pPr>
+      <w:r>
+        <w:rPr>
+          <w:rFonts w:ascii="Arial" w:cs="Arial" w:eastAsia="Arial" w:hAnsi="Arial"/>
+          <w:b/>
+          <w:bCs/>
+        </w:rPr>
+        <w:t xml:space="preserve">What happened: </w:t>
+      </w:r>
+      <w:r>
+        <w:rPr>
+          <w:rFonts w:ascii="Arial" w:cs="Arial" w:eastAsia="Arial" w:hAnsi="Arial"/>
+          <w:sz w:val="22"/>
+          <w:szCs w:val="22"/>
+        </w:rPr>
+        <w:t xml:space="preserve">Whisper doesn’t know your proper nouns. It guesses based on what sounds similar.</w:t>
+      </w:r>
+    </w:p>
+    <w:p>
+      <w:pPr>
+        <w:spacing w:after="200" w:line="276"/>
+      </w:pPr>
+      <w:r>
+        <w:rPr>
+          <w:rFonts w:ascii="Arial" w:cs="Arial" w:eastAsia="Arial" w:hAnsi="Arial"/>
+          <w:b/>
+          <w:bCs/>
+        </w:rPr>
+        <w:t xml:space="preserve">Fix: </w:t>
+      </w:r>
+      <w:r>
+        <w:rPr>
+          <w:rFonts w:ascii="Arial" w:cs="Arial" w:eastAsia="Arial" w:hAnsi="Arial"/>
+          <w:sz w:val="22"/>
+          <w:szCs w:val="22"/>
+        </w:rPr>
+        <w:t xml:space="preserve">Add your words to the vocabulary hints in ~/.claudia/config.json (see Chapter 9). Restart Claudia to pick up changes.</w:t>
+      </w:r>
+    </w:p>
+    <w:p>
+      <w:pPr>
+        <w:spacing w:after="120"/>
+      </w:pPr>
+    </w:p>
+    <w:p>
+      <w:pPr>
+        <w:pStyle w:val="Heading3"/>
+      </w:pPr>
+      <w:r>
+        <w:rPr>
+          <w:b/>
+          <w:bCs/>
+        </w:rPr>
+        <w:t xml:space="preserve">Problem: Updating Claudia to the latest version</w:t>
+      </w:r>
+    </w:p>
+    <w:p>
+      <w:pPr>
+        <w:spacing w:after="200" w:line="276"/>
+      </w:pPr>
+      <w:r>
+        <w:rPr>
+          <w:rFonts w:ascii="Arial" w:cs="Arial" w:eastAsia="Arial" w:hAnsi="Arial"/>
+          <w:b/>
+          <w:bCs/>
+        </w:rPr>
+        <w:t xml:space="preserve">Fix: </w:t>
+      </w:r>
+      <w:r>
+        <w:rPr>
+          <w:rFonts w:ascii="Arial" w:cs="Arial" w:eastAsia="Arial" w:hAnsi="Arial"/>
+          <w:sz w:val="22"/>
+          <w:szCs w:val="22"/>
+        </w:rPr>
+        <w:t xml:space="preserve">Run this command to pull the latest code from GitHub:</w:t>
+      </w:r>
+    </w:p>
+    <w:tbl>
+      <w:tblPr>
+        <w:tblW w:type="dxa" w:w="9360"/>
+        <w:tblBorders>
+          <w:top w:val="single" w:color="auto" w:sz="4"/>
+          <w:left w:val="single" w:color="auto" w:sz="4"/>
+          <w:bottom w:val="single" w:color="auto" w:sz="4"/>
+          <w:right w:val="single" w:color="auto" w:sz="4"/>
+          <w:insideH w:val="single" w:color="auto" w:sz="4"/>
+          <w:insideV w:val="single" w:color="auto" w:sz="4"/>
+        </w:tblBorders>
+      </w:tblPr>
+      <w:tblGrid>
+        <w:gridCol w:w="9360"/>
+      </w:tblGrid>
+      <w:tr>
+        <w:tc>
+          <w:tcPr>
+            <w:tcW w:type="dxa" w:w="9360"/>
+            <w:tcBorders>
+              <w:top w:val="none" w:color="FFFFFF" w:sz="0"/>
+              <w:left w:val="none" w:color="FFFFFF" w:sz="0"/>
+              <w:bottom w:val="none" w:color="FFFFFF" w:sz="0"/>
+              <w:right w:val="none" w:color="FFFFFF" w:sz="0"/>
+            </w:tcBorders>
+            <w:shd w:fill="2C3E50" w:val="clear"/>
+            <w:tcMar>
+              <w:top w:type="dxa" w:w="100"/>
+              <w:left w:type="dxa" w:w="200"/>
+              <w:bottom w:type="dxa" w:w="100"/>
+              <w:right w:type="dxa" w:w="200"/>
+            </w:tcMar>
+          </w:tcPr>
+          <w:p>
+            <w:pPr>
+              <w:spacing w:after="0"/>
+            </w:pPr>
+            <w:r>
+              <w:rPr>
+                <w:rFonts w:ascii="Courier New" w:cs="Courier New" w:eastAsia="Courier New" w:hAnsi="Courier New"/>
+                <w:color w:val="F0F0F0"/>
+                <w:sz w:val="20"/>
+                <w:szCs w:val="20"/>
+              </w:rPr>
+              <w:t xml:space="preserve">pipx install --force git+https://github.com/sevsorensen/claudia-chatterley.git</w:t>
+            </w:r>
+          </w:p>
+        </w:tc>
+      </w:tr>
+    </w:tbl>
+    <w:p>
+      <w:pPr>
+        <w:spacing w:after="120"/>
+      </w:pPr>
+    </w:p>
+    <w:p>
+      <w:pPr>
+        <w:pStyle w:val="Heading3"/>
+      </w:pPr>
+      <w:r>
+        <w:rPr>
+          <w:b/>
+          <w:bCs/>
+        </w:rPr>
+        <w:t xml:space="preserve">Problem: "pip: command not found" or pip install fails</w:t>
+      </w:r>
+    </w:p>
+    <w:p>
+      <w:pPr>
+        <w:spacing w:after="200" w:line="276"/>
+      </w:pPr>
+      <w:r>
+        <w:rPr>
+          <w:rFonts w:ascii="Arial" w:cs="Arial" w:eastAsia="Arial" w:hAnsi="Arial"/>
+          <w:b/>
+          <w:bCs/>
+        </w:rPr>
+        <w:t xml:space="preserve">Fix: </w:t>
+      </w:r>
+      <w:r>
+        <w:rPr>
+          <w:rFonts w:ascii="Arial" w:cs="Arial" w:eastAsia="Arial" w:hAnsi="Arial"/>
+          <w:sz w:val="22"/>
+          <w:szCs w:val="22"/>
+        </w:rPr>
+        <w:t xml:space="preserve">Don’t use pip directly. Use pipx instead (see Option C in Chapter 3). If pipx isn’t installed: </w:t>
       </w:r>
       <w:r>
         <w:rPr>
@@ -8203,7 +8822,37 @@
           <w:szCs w:val="20"/>
           <w:shd w:fill="F2F3F4" w:val="clear"/>
         </w:rPr>
-        <w:t xml:space="preserve">--language fr</w:t>
+        <w:t xml:space="preserve">brew install pipx</w:t>
+      </w:r>
+    </w:p>
+    <w:p>
+      <w:pPr>
+        <w:spacing w:after="120"/>
+      </w:pPr>
+    </w:p>
+    <w:p>
+      <w:pPr>
+        <w:pStyle w:val="Heading3"/>
+      </w:pPr>
+      <w:r>
+        <w:rPr>
+          <w:b/>
+          <w:bCs/>
+        </w:rPr>
+        <w:t xml:space="preserve">Problem: "command not found: brew"</w:t>
+      </w:r>
+    </w:p>
+    <w:p>
+      <w:pPr>
+        <w:spacing w:after="200" w:line="276"/>
+      </w:pPr>
+      <w:r>
+        <w:rPr>
+          <w:rFonts w:ascii="Arial" w:cs="Arial" w:eastAsia="Arial" w:hAnsi="Arial"/>
+          <w:b/>
+          <w:bCs/>
+        </w:rPr>
+        <w:t xml:space="preserve">What happened: </w:t>
       </w:r>
       <w:r>
         <w:rPr>
@@ -8211,7 +8860,152 @@
           <w:sz w:val="22"/>
           <w:szCs w:val="22"/>
         </w:rPr>
-        <w:t xml:space="preserve"> for French, </w:t>
+        <w:t xml:space="preserve">Homebrew is not installed on your Mac. Most Macs don’t come with it.</w:t>
+      </w:r>
+    </w:p>
+    <w:p>
+      <w:pPr>
+        <w:spacing w:after="200" w:line="276"/>
+      </w:pPr>
+      <w:r>
+        <w:rPr>
+          <w:rFonts w:ascii="Arial" w:cs="Arial" w:eastAsia="Arial" w:hAnsi="Arial"/>
+          <w:b/>
+          <w:bCs/>
+        </w:rPr>
+        <w:t xml:space="preserve">Fix: </w:t>
+      </w:r>
+      <w:r>
+        <w:rPr>
+          <w:rFonts w:ascii="Arial" w:cs="Arial" w:eastAsia="Arial" w:hAnsi="Arial"/>
+          <w:sz w:val="22"/>
+          <w:szCs w:val="22"/>
+        </w:rPr>
+        <w:t xml:space="preserve">Run the smart installer from Chapter 3 (Option A). It will install Homebrew for you. Or install Homebrew manually by pasting this into Terminal:</w:t>
+      </w:r>
+    </w:p>
+    <w:tbl>
+      <w:tblPr>
+        <w:tblW w:type="dxa" w:w="9360"/>
+        <w:tblBorders>
+          <w:top w:val="single" w:color="auto" w:sz="4"/>
+          <w:left w:val="single" w:color="auto" w:sz="4"/>
+          <w:bottom w:val="single" w:color="auto" w:sz="4"/>
+          <w:right w:val="single" w:color="auto" w:sz="4"/>
+          <w:insideH w:val="single" w:color="auto" w:sz="4"/>
+          <w:insideV w:val="single" w:color="auto" w:sz="4"/>
+        </w:tblBorders>
+      </w:tblPr>
+      <w:tblGrid>
+        <w:gridCol w:w="9360"/>
+      </w:tblGrid>
+      <w:tr>
+        <w:tc>
+          <w:tcPr>
+            <w:tcW w:type="dxa" w:w="9360"/>
+            <w:tcBorders>
+              <w:top w:val="none" w:color="FFFFFF" w:sz="0"/>
+              <w:left w:val="none" w:color="FFFFFF" w:sz="0"/>
+              <w:bottom w:val="none" w:color="FFFFFF" w:sz="0"/>
+              <w:right w:val="none" w:color="FFFFFF" w:sz="0"/>
+            </w:tcBorders>
+            <w:shd w:fill="2C3E50" w:val="clear"/>
+            <w:tcMar>
+              <w:top w:type="dxa" w:w="100"/>
+              <w:left w:type="dxa" w:w="200"/>
+              <w:bottom w:type="dxa" w:w="100"/>
+              <w:right w:type="dxa" w:w="200"/>
+            </w:tcMar>
+          </w:tcPr>
+          <w:p>
+            <w:pPr>
+              <w:spacing w:after="0"/>
+            </w:pPr>
+            <w:r>
+              <w:rPr>
+                <w:rFonts w:ascii="Courier New" w:cs="Courier New" w:eastAsia="Courier New" w:hAnsi="Courier New"/>
+                <w:color w:val="F0F0F0"/>
+                <w:sz w:val="20"/>
+                <w:szCs w:val="20"/>
+              </w:rPr>
+              <w:t xml:space="preserve">/bin/bash -c "$(curl -fsSL https://raw.githubusercontent.com/Homebrew/install/HEAD/install.sh)"</w:t>
+            </w:r>
+          </w:p>
+        </w:tc>
+      </w:tr>
+    </w:tbl>
+    <w:p>
+      <w:pPr>
+        <w:spacing w:after="200" w:line="276"/>
+      </w:pPr>
+      <w:r>
+        <w:rPr>
+          <w:rFonts w:ascii="Arial" w:cs="Arial" w:eastAsia="Arial" w:hAnsi="Arial"/>
+          <w:i/>
+          <w:iCs/>
+          <w:sz w:val="22"/>
+          <w:szCs w:val="22"/>
+        </w:rPr>
+        <w:t xml:space="preserve">After installing, close Terminal and open a new window for the brew command to work.</w:t>
+      </w:r>
+    </w:p>
+    <w:p>
+      <w:pPr>
+        <w:spacing w:after="120"/>
+      </w:pPr>
+    </w:p>
+    <w:p>
+      <w:pPr>
+        <w:pStyle w:val="Heading3"/>
+      </w:pPr>
+      <w:r>
+        <w:rPr>
+          <w:b/>
+          <w:bCs/>
+        </w:rPr>
+        <w:t xml:space="preserve">Problem: "Python 3.10+ required (found 3.9)"</w:t>
+      </w:r>
+    </w:p>
+    <w:p>
+      <w:pPr>
+        <w:spacing w:after="200" w:line="276"/>
+      </w:pPr>
+      <w:r>
+        <w:rPr>
+          <w:rFonts w:ascii="Arial" w:cs="Arial" w:eastAsia="Arial" w:hAnsi="Arial"/>
+          <w:b/>
+          <w:bCs/>
+        </w:rPr>
+        <w:t xml:space="preserve">What happened: </w:t>
+      </w:r>
+      <w:r>
+        <w:rPr>
+          <w:rFonts w:ascii="Arial" w:cs="Arial" w:eastAsia="Arial" w:hAnsi="Arial"/>
+          <w:sz w:val="22"/>
+          <w:szCs w:val="22"/>
+        </w:rPr>
+        <w:t xml:space="preserve">Your Mac has an older version of Python that came pre-installed with macOS. Claudia needs a newer version.</w:t>
+      </w:r>
+    </w:p>
+    <w:p>
+      <w:pPr>
+        <w:spacing w:after="200" w:line="276"/>
+      </w:pPr>
+      <w:r>
+        <w:rPr>
+          <w:rFonts w:ascii="Arial" w:cs="Arial" w:eastAsia="Arial" w:hAnsi="Arial"/>
+          <w:b/>
+          <w:bCs/>
+        </w:rPr>
+        <w:t xml:space="preserve">Fix: </w:t>
+      </w:r>
+      <w:r>
+        <w:rPr>
+          <w:rFonts w:ascii="Arial" w:cs="Arial" w:eastAsia="Arial" w:hAnsi="Arial"/>
+          <w:sz w:val="22"/>
+          <w:szCs w:val="22"/>
+        </w:rPr>
+        <w:t xml:space="preserve">Install a newer Python with: </w:t>
       </w:r>
       <w:r>
         <w:rPr>
@@ -8221,7 +9015,7 @@
           <w:szCs w:val="20"/>
           <w:shd w:fill="F2F3F4" w:val="clear"/>
         </w:rPr>
-        <w:t xml:space="preserve">--language de</w:t>
+        <w:t xml:space="preserve">brew install python@3.12</w:t>
       </w:r>
       <w:r>
         <w:rPr>
@@ -8229,7 +9023,113 @@
           <w:sz w:val="22"/>
           <w:szCs w:val="22"/>
         </w:rPr>
-        <w:t xml:space="preserve"> for German, and so on. Use </w:t>
+        <w:t xml:space="preserve">. This does NOT replace your old Python — it adds a new one alongside it. Then restart Claudia.</w:t>
+      </w:r>
+    </w:p>
+    <w:p>
+      <w:pPr>
+        <w:pStyle w:val="Heading1"/>
+        <w:pageBreakBefore/>
+      </w:pPr>
+      <w:r>
+        <w:rPr>
+          <w:b/>
+          <w:bCs/>
+        </w:rPr>
+        <w:t xml:space="preserve">14. Frequently Asked Questions</w:t>
+      </w:r>
+    </w:p>
+    <w:p>
+      <w:pPr>
+        <w:spacing w:after="120"/>
+      </w:pPr>
+    </w:p>
+    <w:p>
+      <w:pPr>
+        <w:spacing w:after="200" w:line="276"/>
+      </w:pPr>
+      <w:r>
+        <w:rPr>
+          <w:rFonts w:ascii="Arial" w:cs="Arial" w:eastAsia="Arial" w:hAnsi="Arial"/>
+          <w:b/>
+          <w:bCs/>
+        </w:rPr>
+        <w:t xml:space="preserve">Q: Does Claudia send my voice to the internet?</w:t>
+      </w:r>
+    </w:p>
+    <w:p>
+      <w:pPr>
+        <w:spacing w:after="200" w:line="276"/>
+      </w:pPr>
+      <w:r>
+        <w:rPr>
+          <w:rFonts w:ascii="Arial" w:cs="Arial" w:eastAsia="Arial" w:hAnsi="Arial"/>
+          <w:sz w:val="22"/>
+          <w:szCs w:val="22"/>
+        </w:rPr>
+        <w:t xml:space="preserve">A: Not by default. In local mode (the default), everything stays on your Mac. Only if you choose to use Groq cloud mode does audio leave your computer.</w:t>
+      </w:r>
+    </w:p>
+    <w:p>
+      <w:pPr>
+        <w:spacing w:after="120"/>
+      </w:pPr>
+    </w:p>
+    <w:p>
+      <w:pPr>
+        <w:spacing w:after="200" w:line="276"/>
+      </w:pPr>
+      <w:r>
+        <w:rPr>
+          <w:rFonts w:ascii="Arial" w:cs="Arial" w:eastAsia="Arial" w:hAnsi="Arial"/>
+          <w:b/>
+          <w:bCs/>
+        </w:rPr>
+        <w:t xml:space="preserve">Q: Does Claudia work in apps other than Cowork?</w:t>
+      </w:r>
+    </w:p>
+    <w:p>
+      <w:pPr>
+        <w:spacing w:after="200" w:line="276"/>
+      </w:pPr>
+      <w:r>
+        <w:rPr>
+          <w:rFonts w:ascii="Arial" w:cs="Arial" w:eastAsia="Arial" w:hAnsi="Arial"/>
+          <w:sz w:val="22"/>
+          <w:szCs w:val="22"/>
+        </w:rPr>
+        <w:t xml:space="preserve">A: Yes! Claudia works in any app on your Mac — Chrome, Safari, Notes, Word, Slack, Terminal, anything that accepts text. It works at the operating system level, not inside any single app.</w:t>
+      </w:r>
+    </w:p>
+    <w:p>
+      <w:pPr>
+        <w:spacing w:after="120"/>
+      </w:pPr>
+    </w:p>
+    <w:p>
+      <w:pPr>
+        <w:spacing w:after="200" w:line="276"/>
+      </w:pPr>
+      <w:r>
+        <w:rPr>
+          <w:rFonts w:ascii="Arial" w:cs="Arial" w:eastAsia="Arial" w:hAnsi="Arial"/>
+          <w:b/>
+          <w:bCs/>
+        </w:rPr>
+        <w:t xml:space="preserve">Q: Can Claudia understand languages other than English?</w:t>
+      </w:r>
+    </w:p>
+    <w:p>
+      <w:pPr>
+        <w:spacing w:after="200" w:line="276"/>
+      </w:pPr>
+      <w:r>
+        <w:rPr>
+          <w:rFonts w:ascii="Arial" w:cs="Arial" w:eastAsia="Arial" w:hAnsi="Arial"/>
+          <w:sz w:val="22"/>
+          <w:szCs w:val="22"/>
+        </w:rPr>
+        <w:t xml:space="preserve">A: Yes. Whisper supports dozens of languages. Use </w:t>
       </w:r>
       <w:r>
         <w:rPr>
@@ -8239,7 +9139,7 @@
           <w:szCs w:val="20"/>
           <w:shd w:fill="F2F3F4" w:val="clear"/>
         </w:rPr>
-        <w:t xml:space="preserve">--language auto</w:t>
+        <w:t xml:space="preserve">claudia --language es</w:t>
       </w:r>
       <w:r>
         <w:rPr>
@@ -8247,38 +9147,7 @@
           <w:sz w:val="22"/>
           <w:szCs w:val="22"/>
         </w:rPr>
-        <w:t xml:space="preserve"> to let Claudia figure out what language you’re speaking.</w:t>
-      </w:r>
-    </w:p>
-    <w:p>
-      <w:pPr>
-        <w:spacing w:after="120"/>
-      </w:pPr>
-    </w:p>
-    <w:p>
-      <w:pPr>
-        <w:spacing w:after="200" w:line="276"/>
-      </w:pPr>
-      <w:r>
-        <w:rPr>
-          <w:rFonts w:ascii="Arial" w:cs="Arial" w:eastAsia="Arial" w:hAnsi="Arial"/>
-          <w:b/>
-          <w:bCs/>
-        </w:rPr>
-        <w:t xml:space="preserve">Q: Can I use Claudia while on a Zoom call?</w:t>
-      </w:r>
-    </w:p>
-    <w:p>
-      <w:pPr>
-        <w:spacing w:after="200" w:line="276"/>
-      </w:pPr>
-      <w:r>
-        <w:rPr>
-          <w:rFonts w:ascii="Arial" w:cs="Arial" w:eastAsia="Arial" w:hAnsi="Arial"/>
-          <w:sz w:val="22"/>
-          <w:szCs w:val="22"/>
-        </w:rPr>
-        <w:t xml:space="preserve">A: Yes, but make sure Claudia is using the right microphone. Use </w:t>
+        <w:t xml:space="preserve"> for Spanish, </w:t>
       </w:r>
       <w:r>
         <w:rPr>
@@ -8288,7 +9157,7 @@
           <w:szCs w:val="20"/>
           <w:shd w:fill="F2F3F4" w:val="clear"/>
         </w:rPr>
-        <w:t xml:space="preserve">claudia --devices</w:t>
+        <w:t xml:space="preserve">--language fr</w:t>
       </w:r>
       <w:r>
         <w:rPr>
@@ -8296,7 +9165,7 @@
           <w:sz w:val="22"/>
           <w:szCs w:val="22"/>
         </w:rPr>
-        <w:t xml:space="preserve"> to see your microphones, and </w:t>
+        <w:t xml:space="preserve"> for French, </w:t>
       </w:r>
       <w:r>
         <w:rPr>
@@ -8306,7 +9175,7 @@
           <w:szCs w:val="20"/>
           <w:shd w:fill="F2F3F4" w:val="clear"/>
         </w:rPr>
-        <w:t xml:space="preserve">claudia --device N</w:t>
+        <w:t xml:space="preserve">--language de</w:t>
       </w:r>
       <w:r>
         <w:rPr>
@@ -8314,7 +9183,25 @@
           <w:sz w:val="22"/>
           <w:szCs w:val="22"/>
         </w:rPr>
-        <w:t xml:space="preserve"> to pick one that isn’t your Zoom microphone.</w:t>
+        <w:t xml:space="preserve"> for German, and so on. Use </w:t>
+      </w:r>
+      <w:r>
+        <w:rPr>
+          <w:rFonts w:ascii="Courier New" w:cs="Courier New" w:eastAsia="Courier New" w:hAnsi="Courier New"/>
+          <w:color w:val="2C3E50"/>
+          <w:sz w:val="20"/>
+          <w:szCs w:val="20"/>
+          <w:shd w:fill="F2F3F4" w:val="clear"/>
+        </w:rPr>
+        <w:t xml:space="preserve">--language auto</w:t>
+      </w:r>
+      <w:r>
+        <w:rPr>
+          <w:rFonts w:ascii="Arial" w:cs="Arial" w:eastAsia="Arial" w:hAnsi="Arial"/>
+          <w:sz w:val="22"/>
+          <w:szCs w:val="22"/>
+        </w:rPr>
+        <w:t xml:space="preserve"> to let Claudia figure out what language you’re speaking.</w:t>
       </w:r>
     </w:p>
     <w:p>
@@ -8332,7 +9219,7 @@
           <w:b/>
           <w:bCs/>
         </w:rPr>
-        <w:t xml:space="preserve">Q: How much does Claudia cost?</w:t>
+        <w:t xml:space="preserve">Q: Can I use Claudia while on a Zoom call?</w:t>
       </w:r>
     </w:p>
     <w:p>
@@ -8345,7 +9232,43 @@
           <w:sz w:val="22"/>
           <w:szCs w:val="22"/>
         </w:rPr>
-        <w:t xml:space="preserve">A: Claudia is 100% free and open source under the MIT License. Groq’s cloud API has a free tier; check their website for current limits.</w:t>
+        <w:t xml:space="preserve">A: Yes, but make sure Claudia is using the right microphone. Use </w:t>
+      </w:r>
+      <w:r>
+        <w:rPr>
+          <w:rFonts w:ascii="Courier New" w:cs="Courier New" w:eastAsia="Courier New" w:hAnsi="Courier New"/>
+          <w:color w:val="2C3E50"/>
+          <w:sz w:val="20"/>
+          <w:szCs w:val="20"/>
+          <w:shd w:fill="F2F3F4" w:val="clear"/>
+        </w:rPr>
+        <w:t xml:space="preserve">claudia --devices</w:t>
+      </w:r>
+      <w:r>
+        <w:rPr>
+          <w:rFonts w:ascii="Arial" w:cs="Arial" w:eastAsia="Arial" w:hAnsi="Arial"/>
+          <w:sz w:val="22"/>
+          <w:szCs w:val="22"/>
+        </w:rPr>
+        <w:t xml:space="preserve"> to see your microphones, and </w:t>
+      </w:r>
+      <w:r>
+        <w:rPr>
+          <w:rFonts w:ascii="Courier New" w:cs="Courier New" w:eastAsia="Courier New" w:hAnsi="Courier New"/>
+          <w:color w:val="2C3E50"/>
+          <w:sz w:val="20"/>
+          <w:szCs w:val="20"/>
+          <w:shd w:fill="F2F3F4" w:val="clear"/>
+        </w:rPr>
+        <w:t xml:space="preserve">claudia --device N</w:t>
+      </w:r>
+      <w:r>
+        <w:rPr>
+          <w:rFonts w:ascii="Arial" w:cs="Arial" w:eastAsia="Arial" w:hAnsi="Arial"/>
+          <w:sz w:val="22"/>
+          <w:szCs w:val="22"/>
+        </w:rPr>
+        <w:t xml:space="preserve"> to pick one that isn’t your Zoom microphone.</w:t>
       </w:r>
     </w:p>
     <w:p>
@@ -8363,7 +9286,7 @@
           <w:b/>
           <w:bCs/>
         </w:rPr>
-        <w:t xml:space="preserve">Q: Does it work on Windows or Linux?</w:t>
+        <w:t xml:space="preserve">Q: How much does Claudia cost?</w:t>
       </w:r>
     </w:p>
     <w:p>
@@ -8376,7 +9299,7 @@
           <w:sz w:val="22"/>
           <w:szCs w:val="22"/>
         </w:rPr>
-        <w:t xml:space="preserve">A: Claudia is designed for macOS. The transcription engine will work on other platforms, but the floating widget and auto-paste features are macOS-specific. Cross-platform support may come in a future version.</w:t>
+        <w:t xml:space="preserve">A: Claudia is 100% free and open source under the MIT License. Groq’s cloud API has a free tier; check their website for current limits.</w:t>
       </w:r>
     </w:p>
     <w:p>
@@ -8394,7 +9317,7 @@
           <w:b/>
           <w:bCs/>
         </w:rPr>
-        <w:t xml:space="preserve">Q: Why is it called “Claudia Chatterley”?</w:t>
+        <w:t xml:space="preserve">Q: Does it work on Windows or Linux?</w:t>
       </w:r>
     </w:p>
     <w:p>
@@ -8407,7 +9330,7 @@
           <w:sz w:val="22"/>
           <w:szCs w:val="22"/>
         </w:rPr>
-        <w:t xml:space="preserve">A: The author, Severin Sorensen, has affectionately called Claude “Claudia Chatterley” for years — keeping the naming tradition he started with “Amelia Chatterley” for ChatGPT. Every good AI deserves a proper name.</w:t>
+        <w:t xml:space="preserve">A: Claudia is designed for macOS. The transcription engine will work on other platforms, but the floating widget and auto-paste features are macOS-specific. Cross-platform support may come in a future version.</w:t>
       </w:r>
     </w:p>
     <w:p>
@@ -8417,14 +9340,45 @@
     </w:p>
     <w:p>
       <w:pPr>
-        <w:pStyle w:val="Heading1"/>
-      </w:pPr>
-      <w:r>
-        <w:rPr>
+        <w:spacing w:after="200" w:line="276"/>
+      </w:pPr>
+      <w:r>
+        <w:rPr>
+          <w:rFonts w:ascii="Arial" w:cs="Arial" w:eastAsia="Arial" w:hAnsi="Arial"/>
           <w:b/>
           <w:bCs/>
         </w:rPr>
-        <w:t xml:space="preserve">14. What’s Coming Next (Roadmap)</w:t>
+        <w:t xml:space="preserve">Q: Why is it called “Claudia Chatterley”?</w:t>
+      </w:r>
+    </w:p>
+    <w:p>
+      <w:pPr>
+        <w:spacing w:after="200" w:line="276"/>
+      </w:pPr>
+      <w:r>
+        <w:rPr>
+          <w:rFonts w:ascii="Arial" w:cs="Arial" w:eastAsia="Arial" w:hAnsi="Arial"/>
+          <w:sz w:val="22"/>
+          <w:szCs w:val="22"/>
+        </w:rPr>
+        <w:t xml:space="preserve">A: The author, Severin Sorensen, has affectionately called Claude “Claudia Chatterley” for years — keeping the naming tradition he started with “Amelia Chatterley” for ChatGPT. Every good AI deserves a proper name.</w:t>
+      </w:r>
+    </w:p>
+    <w:p>
+      <w:pPr>
+        <w:spacing w:after="120"/>
+      </w:pPr>
+    </w:p>
+    <w:p>
+      <w:pPr>
+        <w:pStyle w:val="Heading1"/>
+      </w:pPr>
+      <w:r>
+        <w:rPr>
+          <w:b/>
+          <w:bCs/>
+        </w:rPr>
+        <w:t xml:space="preserve">15. What’s Coming Next (Roadmap)</w:t>
       </w:r>
     </w:p>
     <w:p>
@@ -8680,7 +9634,7 @@
                 <w:sz w:val="20"/>
                 <w:szCs w:val="20"/>
               </w:rPr>
-              <w:t xml:space="preserve">v0.2</w:t>
+              <w:t xml:space="preserve">v0.1.1</w:t>
             </w:r>
           </w:p>
         </w:tc>
@@ -8712,7 +9666,7 @@
                 <w:sz w:val="20"/>
                 <w:szCs w:val="20"/>
               </w:rPr>
-              <w:t xml:space="preserve">Global hotkey support (Cmd+Shift+Space)</w:t>
+              <w:t xml:space="preserve">Focus tracking, vocabulary hints, “small” model default</w:t>
             </w:r>
           </w:p>
         </w:tc>
@@ -8744,7 +9698,7 @@
                 <w:sz w:val="20"/>
                 <w:szCs w:val="20"/>
               </w:rPr>
-              <w:t xml:space="preserve">Planned</w:t>
+              <w:t xml:space="preserve">Available now</w:t>
             </w:r>
           </w:p>
         </w:tc>
@@ -8778,7 +9732,7 @@
                 <w:sz w:val="20"/>
                 <w:szCs w:val="20"/>
               </w:rPr>
-              <w:t xml:space="preserve">v0.3</w:t>
+              <w:t xml:space="preserve">v0.2</w:t>
             </w:r>
           </w:p>
         </w:tc>
@@ -8810,7 +9764,7 @@
                 <w:sz w:val="20"/>
                 <w:szCs w:val="20"/>
               </w:rPr>
-              <w:t xml:space="preserve">Cowork plugin integration (MCP server)</w:t>
+              <w:t xml:space="preserve">Global hotkey support (Cmd+Shift+Space)</w:t>
             </w:r>
           </w:p>
         </w:tc>
@@ -8876,7 +9830,7 @@
                 <w:sz w:val="20"/>
                 <w:szCs w:val="20"/>
               </w:rPr>
-              <w:t xml:space="preserve">v0.4</w:t>
+              <w:t xml:space="preserve">v0.3</w:t>
             </w:r>
           </w:p>
         </w:tc>
@@ -8908,7 +9862,7 @@
                 <w:sz w:val="20"/>
                 <w:szCs w:val="20"/>
               </w:rPr>
-              <w:t xml:space="preserve">Two-way voice conversation (Claudia speaks back!)</w:t>
+              <w:t xml:space="preserve">Cowork plugin integration (MCP server)</w:t>
             </w:r>
           </w:p>
         </w:tc>
@@ -8974,7 +9928,7 @@
                 <w:sz w:val="20"/>
                 <w:szCs w:val="20"/>
               </w:rPr>
-              <w:t xml:space="preserve">v0.5</w:t>
+              <w:t xml:space="preserve">v0.4</w:t>
             </w:r>
           </w:p>
         </w:tc>
@@ -9006,7 +9960,7 @@
                 <w:sz w:val="20"/>
                 <w:szCs w:val="20"/>
               </w:rPr>
-              <w:t xml:space="preserve">Voice selection (accent, gender, speed)</w:t>
+              <w:t xml:space="preserve">Two-way voice conversation (Claudia speaks back!)</w:t>
             </w:r>
           </w:p>
         </w:tc>
@@ -9072,6 +10026,104 @@
                 <w:sz w:val="20"/>
                 <w:szCs w:val="20"/>
               </w:rPr>
+              <w:t xml:space="preserve">v0.5</w:t>
+            </w:r>
+          </w:p>
+        </w:tc>
+        <w:tc>
+          <w:tcPr>
+            <w:tcW w:type="dxa" w:w="5560"/>
+            <w:tcBorders>
+              <w:top w:val="single" w:color="BDC3C7" w:sz="1"/>
+              <w:left w:val="single" w:color="BDC3C7" w:sz="1"/>
+              <w:bottom w:val="single" w:color="BDC3C7" w:sz="1"/>
+              <w:right w:val="single" w:color="BDC3C7" w:sz="1"/>
+            </w:tcBorders>
+            <w:shd w:fill="F2F3F4" w:val="clear"/>
+            <w:tcMar>
+              <w:top w:type="dxa" w:w="60"/>
+              <w:left w:type="dxa" w:w="100"/>
+              <w:bottom w:type="dxa" w:w="60"/>
+              <w:right w:type="dxa" w:w="100"/>
+            </w:tcMar>
+          </w:tcPr>
+          <w:p>
+            <w:pPr>
+              <w:spacing w:after="0"/>
+            </w:pPr>
+            <w:r>
+              <w:rPr>
+                <w:rFonts w:ascii="Arial" w:cs="Arial" w:eastAsia="Arial" w:hAnsi="Arial"/>
+                <w:color w:val="2C3E50"/>
+                <w:sz w:val="20"/>
+                <w:szCs w:val="20"/>
+              </w:rPr>
+              <w:t xml:space="preserve">Voice selection (accent, gender, speed)</w:t>
+            </w:r>
+          </w:p>
+        </w:tc>
+        <w:tc>
+          <w:tcPr>
+            <w:tcW w:type="dxa" w:w="2600"/>
+            <w:tcBorders>
+              <w:top w:val="single" w:color="BDC3C7" w:sz="1"/>
+              <w:left w:val="single" w:color="BDC3C7" w:sz="1"/>
+              <w:bottom w:val="single" w:color="BDC3C7" w:sz="1"/>
+              <w:right w:val="single" w:color="BDC3C7" w:sz="1"/>
+            </w:tcBorders>
+            <w:shd w:fill="F2F3F4" w:val="clear"/>
+            <w:tcMar>
+              <w:top w:type="dxa" w:w="60"/>
+              <w:left w:type="dxa" w:w="100"/>
+              <w:bottom w:type="dxa" w:w="60"/>
+              <w:right w:type="dxa" w:w="100"/>
+            </w:tcMar>
+          </w:tcPr>
+          <w:p>
+            <w:pPr>
+              <w:spacing w:after="0"/>
+            </w:pPr>
+            <w:r>
+              <w:rPr>
+                <w:rFonts w:ascii="Arial" w:cs="Arial" w:eastAsia="Arial" w:hAnsi="Arial"/>
+                <w:color w:val="2C3E50"/>
+                <w:sz w:val="20"/>
+                <w:szCs w:val="20"/>
+              </w:rPr>
+              <w:t xml:space="preserve">Planned</w:t>
+            </w:r>
+          </w:p>
+        </w:tc>
+      </w:tr>
+      <w:tr>
+        <w:tc>
+          <w:tcPr>
+            <w:tcW w:type="dxa" w:w="1200"/>
+            <w:tcBorders>
+              <w:top w:val="single" w:color="BDC3C7" w:sz="1"/>
+              <w:left w:val="single" w:color="BDC3C7" w:sz="1"/>
+              <w:bottom w:val="single" w:color="BDC3C7" w:sz="1"/>
+              <w:right w:val="single" w:color="BDC3C7" w:sz="1"/>
+            </w:tcBorders>
+            <w:shd w:fill="FFFFFF" w:val="clear"/>
+            <w:tcMar>
+              <w:top w:type="dxa" w:w="60"/>
+              <w:left w:type="dxa" w:w="100"/>
+              <w:bottom w:type="dxa" w:w="60"/>
+              <w:right w:type="dxa" w:w="100"/>
+            </w:tcMar>
+          </w:tcPr>
+          <w:p>
+            <w:pPr>
+              <w:spacing w:after="0"/>
+            </w:pPr>
+            <w:r>
+              <w:rPr>
+                <w:rFonts w:ascii="Arial" w:cs="Arial" w:eastAsia="Arial" w:hAnsi="Arial"/>
+                <w:color w:val="2C3E50"/>
+                <w:sz w:val="20"/>
+                <w:szCs w:val="20"/>
+              </w:rPr>
               <w:t xml:space="preserve">v1.0</w:t>
             </w:r>
           </w:p>
@@ -9085,7 +10137,7 @@
               <w:bottom w:val="single" w:color="BDC3C7" w:sz="1"/>
               <w:right w:val="single" w:color="BDC3C7" w:sz="1"/>
             </w:tcBorders>
-            <w:shd w:fill="F2F3F4" w:val="clear"/>
+            <w:shd w:fill="FFFFFF" w:val="clear"/>
             <w:tcMar>
               <w:top w:type="dxa" w:w="60"/>
               <w:left w:type="dxa" w:w="100"/>
@@ -9117,7 +10169,7 @@
               <w:bottom w:val="single" w:color="BDC3C7" w:sz="1"/>
               <w:right w:val="single" w:color="BDC3C7" w:sz="1"/>
             </w:tcBorders>
-            <w:shd w:fill="F2F3F4" w:val="clear"/>
+            <w:shd w:fill="FFFFFF" w:val="clear"/>
             <w:tcMar>
               <w:top w:type="dxa" w:w="60"/>
               <w:left w:type="dxa" w:w="100"/>
@@ -9152,7 +10204,7 @@
           <w:b/>
           <w:bCs/>
         </w:rPr>
-        <w:t xml:space="preserve">15. Glossary — Words You Might Not Know</w:t>
+        <w:t xml:space="preserve">16. Glossary — Words You Might Not Know</w:t>
       </w:r>
     </w:p>
     <w:p>
@@ -9882,7 +10934,7 @@
                 <w:sz w:val="20"/>
                 <w:szCs w:val="20"/>
               </w:rPr>
-              <w:t xml:space="preserve">pip</w:t>
+              <w:t xml:space="preserve">PEP 668</w:t>
             </w:r>
           </w:p>
         </w:tc>
@@ -9914,7 +10966,7 @@
                 <w:sz w:val="20"/>
                 <w:szCs w:val="20"/>
               </w:rPr>
-              <w:t xml:space="preserve">A tool that downloads and installs Python programs from the internet.</w:t>
+              <w:t xml:space="preserve">A Python policy that prevents installing packages system-wide. That’s why we use pipx instead of pip.</w:t>
             </w:r>
           </w:p>
         </w:tc>
@@ -9948,7 +11000,7 @@
                 <w:sz w:val="20"/>
                 <w:szCs w:val="20"/>
               </w:rPr>
-              <w:t xml:space="preserve">portaudio</w:t>
+              <w:t xml:space="preserve">pip</w:t>
             </w:r>
           </w:p>
         </w:tc>
@@ -9980,7 +11032,7 @@
                 <w:sz w:val="20"/>
                 <w:szCs w:val="20"/>
               </w:rPr>
-              <w:t xml:space="preserve">A small helper program that lets other programs (like Claudia) use your microphone.</w:t>
+              <w:t xml:space="preserve">A tool that downloads and installs Python programs from the internet.</w:t>
             </w:r>
           </w:p>
         </w:tc>
@@ -10014,7 +11066,7 @@
                 <w:sz w:val="20"/>
                 <w:szCs w:val="20"/>
               </w:rPr>
-              <w:t xml:space="preserve">Python</w:t>
+              <w:t xml:space="preserve">pipx</w:t>
             </w:r>
           </w:p>
         </w:tc>
@@ -10046,7 +11098,7 @@
                 <w:sz w:val="20"/>
                 <w:szCs w:val="20"/>
               </w:rPr>
-              <w:t xml:space="preserve">A popular programming language. Claudia is written in Python.</w:t>
+              <w:t xml:space="preserve">A safer version of pip that installs each program in its own isolated space, so nothing conflicts.</w:t>
             </w:r>
           </w:p>
         </w:tc>
@@ -10080,7 +11132,7 @@
                 <w:sz w:val="20"/>
                 <w:szCs w:val="20"/>
               </w:rPr>
-              <w:t xml:space="preserve">Terminal</w:t>
+              <w:t xml:space="preserve">portaudio</w:t>
             </w:r>
           </w:p>
         </w:tc>
@@ -10112,7 +11164,7 @@
                 <w:sz w:val="20"/>
                 <w:szCs w:val="20"/>
               </w:rPr>
-              <w:t xml:space="preserve">An app on your Mac where you type commands instead of clicking buttons.</w:t>
+              <w:t xml:space="preserve">A small helper program that lets other programs (like Claudia) use your microphone.</w:t>
             </w:r>
           </w:p>
         </w:tc>
@@ -10146,7 +11198,7 @@
                 <w:sz w:val="20"/>
                 <w:szCs w:val="20"/>
               </w:rPr>
-              <w:t xml:space="preserve">Transcription</w:t>
+              <w:t xml:space="preserve">Python</w:t>
             </w:r>
           </w:p>
         </w:tc>
@@ -10178,7 +11230,7 @@
                 <w:sz w:val="20"/>
                 <w:szCs w:val="20"/>
               </w:rPr>
-              <w:t xml:space="preserve">The process of turning spoken words into written text.</w:t>
+              <w:t xml:space="preserve">A popular programming language. Claudia is written in Python.</w:t>
             </w:r>
           </w:p>
         </w:tc>
@@ -10212,7 +11264,7 @@
                 <w:sz w:val="20"/>
                 <w:szCs w:val="20"/>
               </w:rPr>
-              <w:t xml:space="preserve">VAD</w:t>
+              <w:t xml:space="preserve">Terminal</w:t>
             </w:r>
           </w:p>
         </w:tc>
@@ -10244,7 +11296,7 @@
                 <w:sz w:val="20"/>
                 <w:szCs w:val="20"/>
               </w:rPr>
-              <w:t xml:space="preserve">Voice Activity Detection — Claudia’s ability to know when you’re speaking vs. silent.</w:t>
+              <w:t xml:space="preserve">An app on your Mac where you type commands instead of clicking buttons.</w:t>
             </w:r>
           </w:p>
         </w:tc>
@@ -10278,7 +11330,7 @@
                 <w:sz w:val="20"/>
                 <w:szCs w:val="20"/>
               </w:rPr>
-              <w:t xml:space="preserve">Whisper</w:t>
+              <w:t xml:space="preserve">Transcription</w:t>
             </w:r>
           </w:p>
         </w:tc>
@@ -10310,7 +11362,7 @@
                 <w:sz w:val="20"/>
                 <w:szCs w:val="20"/>
               </w:rPr>
-              <w:t xml:space="preserve">A speech-recognition program made by OpenAI. Claudia uses it to understand your voice.</w:t>
+              <w:t xml:space="preserve">The process of turning spoken words into written text.</w:t>
             </w:r>
           </w:p>
         </w:tc>
@@ -10344,6 +11396,204 @@
                 <w:sz w:val="20"/>
                 <w:szCs w:val="20"/>
               </w:rPr>
+              <w:t xml:space="preserve">VAD</w:t>
+            </w:r>
+          </w:p>
+        </w:tc>
+        <w:tc>
+          <w:tcPr>
+            <w:tcW w:type="dxa" w:w="7160"/>
+            <w:tcBorders>
+              <w:top w:val="single" w:color="BDC3C7" w:sz="1"/>
+              <w:left w:val="single" w:color="BDC3C7" w:sz="1"/>
+              <w:bottom w:val="single" w:color="BDC3C7" w:sz="1"/>
+              <w:right w:val="single" w:color="BDC3C7" w:sz="1"/>
+            </w:tcBorders>
+            <w:shd w:fill="FFFFFF" w:val="clear"/>
+            <w:tcMar>
+              <w:top w:type="dxa" w:w="60"/>
+              <w:left w:type="dxa" w:w="100"/>
+              <w:bottom w:type="dxa" w:w="60"/>
+              <w:right w:type="dxa" w:w="100"/>
+            </w:tcMar>
+          </w:tcPr>
+          <w:p>
+            <w:pPr>
+              <w:spacing w:after="0"/>
+            </w:pPr>
+            <w:r>
+              <w:rPr>
+                <w:rFonts w:ascii="Arial" w:cs="Arial" w:eastAsia="Arial" w:hAnsi="Arial"/>
+                <w:color w:val="2C3E50"/>
+                <w:sz w:val="20"/>
+                <w:szCs w:val="20"/>
+              </w:rPr>
+              <w:t xml:space="preserve">Voice Activity Detection — Claudia’s ability to know when you’re speaking vs. silent.</w:t>
+            </w:r>
+          </w:p>
+        </w:tc>
+      </w:tr>
+      <w:tr>
+        <w:tc>
+          <w:tcPr>
+            <w:tcW w:type="dxa" w:w="2200"/>
+            <w:tcBorders>
+              <w:top w:val="single" w:color="BDC3C7" w:sz="1"/>
+              <w:left w:val="single" w:color="BDC3C7" w:sz="1"/>
+              <w:bottom w:val="single" w:color="BDC3C7" w:sz="1"/>
+              <w:right w:val="single" w:color="BDC3C7" w:sz="1"/>
+            </w:tcBorders>
+            <w:shd w:fill="F2F3F4" w:val="clear"/>
+            <w:tcMar>
+              <w:top w:type="dxa" w:w="60"/>
+              <w:left w:type="dxa" w:w="100"/>
+              <w:bottom w:type="dxa" w:w="60"/>
+              <w:right w:type="dxa" w:w="100"/>
+            </w:tcMar>
+          </w:tcPr>
+          <w:p>
+            <w:pPr>
+              <w:spacing w:after="0"/>
+            </w:pPr>
+            <w:r>
+              <w:rPr>
+                <w:rFonts w:ascii="Arial" w:cs="Arial" w:eastAsia="Arial" w:hAnsi="Arial"/>
+                <w:color w:val="2C3E50"/>
+                <w:sz w:val="20"/>
+                <w:szCs w:val="20"/>
+              </w:rPr>
+              <w:t xml:space="preserve">Vocabulary Hints</w:t>
+            </w:r>
+          </w:p>
+        </w:tc>
+        <w:tc>
+          <w:tcPr>
+            <w:tcW w:type="dxa" w:w="7160"/>
+            <w:tcBorders>
+              <w:top w:val="single" w:color="BDC3C7" w:sz="1"/>
+              <w:left w:val="single" w:color="BDC3C7" w:sz="1"/>
+              <w:bottom w:val="single" w:color="BDC3C7" w:sz="1"/>
+              <w:right w:val="single" w:color="BDC3C7" w:sz="1"/>
+            </w:tcBorders>
+            <w:shd w:fill="F2F3F4" w:val="clear"/>
+            <w:tcMar>
+              <w:top w:type="dxa" w:w="60"/>
+              <w:left w:type="dxa" w:w="100"/>
+              <w:bottom w:type="dxa" w:w="60"/>
+              <w:right w:type="dxa" w:w="100"/>
+            </w:tcMar>
+          </w:tcPr>
+          <w:p>
+            <w:pPr>
+              <w:spacing w:after="0"/>
+            </w:pPr>
+            <w:r>
+              <w:rPr>
+                <w:rFonts w:ascii="Arial" w:cs="Arial" w:eastAsia="Arial" w:hAnsi="Arial"/>
+                <w:color w:val="2C3E50"/>
+                <w:sz w:val="20"/>
+                <w:szCs w:val="20"/>
+              </w:rPr>
+              <w:t xml:space="preserve">A list of words you teach Claudia so it spells your proper nouns correctly.</w:t>
+            </w:r>
+          </w:p>
+        </w:tc>
+      </w:tr>
+      <w:tr>
+        <w:tc>
+          <w:tcPr>
+            <w:tcW w:type="dxa" w:w="2200"/>
+            <w:tcBorders>
+              <w:top w:val="single" w:color="BDC3C7" w:sz="1"/>
+              <w:left w:val="single" w:color="BDC3C7" w:sz="1"/>
+              <w:bottom w:val="single" w:color="BDC3C7" w:sz="1"/>
+              <w:right w:val="single" w:color="BDC3C7" w:sz="1"/>
+            </w:tcBorders>
+            <w:shd w:fill="FFFFFF" w:val="clear"/>
+            <w:tcMar>
+              <w:top w:type="dxa" w:w="60"/>
+              <w:left w:type="dxa" w:w="100"/>
+              <w:bottom w:type="dxa" w:w="60"/>
+              <w:right w:type="dxa" w:w="100"/>
+            </w:tcMar>
+          </w:tcPr>
+          <w:p>
+            <w:pPr>
+              <w:spacing w:after="0"/>
+            </w:pPr>
+            <w:r>
+              <w:rPr>
+                <w:rFonts w:ascii="Arial" w:cs="Arial" w:eastAsia="Arial" w:hAnsi="Arial"/>
+                <w:color w:val="2C3E50"/>
+                <w:sz w:val="20"/>
+                <w:szCs w:val="20"/>
+              </w:rPr>
+              <w:t xml:space="preserve">Whisper</w:t>
+            </w:r>
+          </w:p>
+        </w:tc>
+        <w:tc>
+          <w:tcPr>
+            <w:tcW w:type="dxa" w:w="7160"/>
+            <w:tcBorders>
+              <w:top w:val="single" w:color="BDC3C7" w:sz="1"/>
+              <w:left w:val="single" w:color="BDC3C7" w:sz="1"/>
+              <w:bottom w:val="single" w:color="BDC3C7" w:sz="1"/>
+              <w:right w:val="single" w:color="BDC3C7" w:sz="1"/>
+            </w:tcBorders>
+            <w:shd w:fill="FFFFFF" w:val="clear"/>
+            <w:tcMar>
+              <w:top w:type="dxa" w:w="60"/>
+              <w:left w:type="dxa" w:w="100"/>
+              <w:bottom w:type="dxa" w:w="60"/>
+              <w:right w:type="dxa" w:w="100"/>
+            </w:tcMar>
+          </w:tcPr>
+          <w:p>
+            <w:pPr>
+              <w:spacing w:after="0"/>
+            </w:pPr>
+            <w:r>
+              <w:rPr>
+                <w:rFonts w:ascii="Arial" w:cs="Arial" w:eastAsia="Arial" w:hAnsi="Arial"/>
+                <w:color w:val="2C3E50"/>
+                <w:sz w:val="20"/>
+                <w:szCs w:val="20"/>
+              </w:rPr>
+              <w:t xml:space="preserve">A speech-recognition program made by OpenAI. Claudia uses it to understand your voice.</w:t>
+            </w:r>
+          </w:p>
+        </w:tc>
+      </w:tr>
+      <w:tr>
+        <w:tc>
+          <w:tcPr>
+            <w:tcW w:type="dxa" w:w="2200"/>
+            <w:tcBorders>
+              <w:top w:val="single" w:color="BDC3C7" w:sz="1"/>
+              <w:left w:val="single" w:color="BDC3C7" w:sz="1"/>
+              <w:bottom w:val="single" w:color="BDC3C7" w:sz="1"/>
+              <w:right w:val="single" w:color="BDC3C7" w:sz="1"/>
+            </w:tcBorders>
+            <w:shd w:fill="F2F3F4" w:val="clear"/>
+            <w:tcMar>
+              <w:top w:type="dxa" w:w="60"/>
+              <w:left w:type="dxa" w:w="100"/>
+              <w:bottom w:type="dxa" w:w="60"/>
+              <w:right w:type="dxa" w:w="100"/>
+            </w:tcMar>
+          </w:tcPr>
+          <w:p>
+            <w:pPr>
+              <w:spacing w:after="0"/>
+            </w:pPr>
+            <w:r>
+              <w:rPr>
+                <w:rFonts w:ascii="Arial" w:cs="Arial" w:eastAsia="Arial" w:hAnsi="Arial"/>
+                <w:color w:val="2C3E50"/>
+                <w:sz w:val="20"/>
+                <w:szCs w:val="20"/>
+              </w:rPr>
               <w:t xml:space="preserve">Widget</w:t>
             </w:r>
           </w:p>
@@ -10357,7 +11607,7 @@
               <w:bottom w:val="single" w:color="BDC3C7" w:sz="1"/>
               <w:right w:val="single" w:color="BDC3C7" w:sz="1"/>
             </w:tcBorders>
-            <w:shd w:fill="FFFFFF" w:val="clear"/>
+            <w:shd w:fill="F2F3F4" w:val="clear"/>
             <w:tcMar>
               <w:top w:type="dxa" w:w="60"/>
               <w:left w:type="dxa" w:w="100"/>
@@ -10442,7 +11692,7 @@
         </w:rPr>
         <w:t xml:space="preserve">GitHub: </w:t>
       </w:r>
-      <w:hyperlink w:history="1" r:id="rId4jee_ovmqilrwnq4v-4xi">
+      <w:hyperlink w:history="1" r:id="rId3okc25wwbtzhbyv3dkqbq">
         <w:r>
           <w:rPr>
             <w:rStyle w:val="Hyperlink"/>
@@ -10450,7 +11700,7 @@
             <w:sz w:val="22"/>
             <w:szCs w:val="22"/>
           </w:rPr>
-          <w:t xml:space="preserve">github.com/severinsorensen/claudia-chatterley</w:t>
+          <w:t xml:space="preserve">github.com/sevsorensen/claudia-chatterley</w:t>
         </w:r>
       </w:hyperlink>
     </w:p>
@@ -10467,7 +11717,7 @@
         </w:rPr>
         <w:t xml:space="preserve">Questions? Email: </w:t>
       </w:r>
-      <w:hyperlink w:history="1" r:id="rIdaxjtidezu9cq6ym5ncomp">
+      <w:hyperlink w:history="1" r:id="rIdi7ctv-wbovpke2sdglyoc">
         <w:r>
           <w:rPr>
             <w:rStyle w:val="Hyperlink"/>

</xml_diff>